<commit_message>
Live results, report/slides updated, teardown verified
</commit_message>
<xml_diff>
--- a/report/CostScale_Report.docx
+++ b/report/CostScale_Report.docx
@@ -65,7 +65,7 @@
           <w:b/>
           <w:sz w:val="30"/>
         </w:rPr>
-        <w:t>[TO FILL: student name - student ID]</w:t>
+        <w:t>Anamay Narkar - 16010123040</w:t>
       </w:r>
     </w:p>
     <w:p>
@@ -78,7 +78,7 @@
           <w:b/>
           <w:sz w:val="30"/>
         </w:rPr>
-        <w:t>[TO FILL: student name - student ID]</w:t>
+        <w:t>Ananya Dhiman - 16010123041</w:t>
       </w:r>
     </w:p>
     <w:p>
@@ -91,7 +91,7 @@
           <w:b/>
           <w:sz w:val="30"/>
         </w:rPr>
-        <w:t>[TO FILL: student name - student ID]</w:t>
+        <w:t>Anoushka Nelson - 16010123049</w:t>
       </w:r>
     </w:p>
     <w:p>
@@ -107,7 +107,7 @@
       </w:pPr>
       <w:r>
         <w:rPr/>
-        <w:t>[TO FILL: programme, year]</w:t>
+        <w:t>B.Tech Computer Engineering, Final Year</w:t>
       </w:r>
     </w:p>
     <w:p>
@@ -117,7 +117,7 @@
       </w:pPr>
       <w:r>
         <w:rPr/>
-        <w:t>[TO FILL: institute, city]</w:t>
+        <w:t>K.J. Somaiya School of Engineering, Mumbai</w:t>
       </w:r>
     </w:p>
     <w:p>
@@ -189,7 +189,7 @@
       </w:pPr>
       <w:r>
         <w:rPr/>
-        <w:t>[LIVE RESULTS PENDING]</w:t>
+        <w:t>A live AWS deployment in ap-south-1 ran four time-compressed experiment arms against the same trace window and compared them with a simulator replay of each arm. On a smooth six-hour ramp, reactive scaling (arm A) and the ML hybrid (arm C) cost the same ($0.038 and $0.039) with p95 latencies of 566 ms and 585 ms, while a static base (arm B) cost 2.2 times as much. With an unseen 4x spike (arm D) no request failed and 48% of that hour's requests went to Lambda, but 20% of all requests exceeded the 800 ms target because the load balancer let EC2 run at its limit. The live runs therefore show that the mechanism works and expose its weak points, but do not show an advantage over reactive scaling on this window; the cost advantage appears in the simulation across bursty functions. Energy is only an estimate; storage and networking are out of scope.</w:t>
       </w:r>
     </w:p>
     <w:p>
@@ -861,7 +861,7 @@
         </w:rPr>
         <w:t>8.9 Validation of the newsvendor rule</w:t>
         <w:tab/>
-        <w:t>25</w:t>
+        <w:t>29</w:t>
       </w:r>
     </w:p>
     <w:p>
@@ -878,7 +878,7 @@
         </w:rPr>
         <w:t>9. What happens when the prediction is wrong</w:t>
         <w:tab/>
-        <w:t>27</w:t>
+        <w:t>30</w:t>
       </w:r>
     </w:p>
     <w:p>
@@ -895,7 +895,7 @@
         </w:rPr>
         <w:t>10. Limitations</w:t>
         <w:tab/>
-        <w:t>29</w:t>
+        <w:t>32</w:t>
       </w:r>
     </w:p>
     <w:p>
@@ -912,7 +912,7 @@
         </w:rPr>
         <w:t>11. Conclusion</w:t>
         <w:tab/>
-        <w:t>30</w:t>
+        <w:t>34</w:t>
       </w:r>
     </w:p>
     <w:p>
@@ -929,7 +929,7 @@
         </w:rPr>
         <w:t>12. Future work</w:t>
         <w:tab/>
-        <w:t>31</w:t>
+        <w:t>35</w:t>
       </w:r>
     </w:p>
     <w:p>
@@ -946,7 +946,7 @@
         </w:rPr>
         <w:t>References</w:t>
         <w:tab/>
-        <w:t>32</w:t>
+        <w:t>36</w:t>
       </w:r>
     </w:p>
     <w:p>
@@ -963,7 +963,7 @@
         </w:rPr>
         <w:t>Appendix A: Reproduction steps</w:t>
         <w:tab/>
-        <w:t>33</w:t>
+        <w:t>37</w:t>
       </w:r>
     </w:p>
     <w:p>
@@ -980,7 +980,7 @@
         </w:rPr>
         <w:t>A.1 Parameters</w:t>
         <w:tab/>
-        <w:t>33</w:t>
+        <w:t>37</w:t>
       </w:r>
     </w:p>
     <w:p>
@@ -1060,7 +1060,27 @@
       </w:pPr>
       <w:r>
         <w:rPr/>
-        <w:t>Figure 7: Effect of an unseen spike on cost and unserved load</w:t>
+        <w:t>Figure 7: Live timelines: request rate, base capacity and EC2 share for each arm</w:t>
+      </w:r>
+    </w:p>
+    <w:p>
+      <w:pPr>
+        <w:spacing w:after="40" w:line="276" w:lineRule="auto"/>
+        <w:ind w:left="0"/>
+      </w:pPr>
+      <w:r>
+        <w:rPr/>
+        <w:t>Figure 8: Live p95 latency per window and cumulative cost for each arm</w:t>
+      </w:r>
+    </w:p>
+    <w:p>
+      <w:pPr>
+        <w:spacing w:after="40" w:line="276" w:lineRule="auto"/>
+        <w:ind w:left="0"/>
+      </w:pPr>
+      <w:r>
+        <w:rPr/>
+        <w:t>Figure 9: Effect of an unseen spike on cost and unserved load</w:t>
       </w:r>
     </w:p>
     <w:p>
@@ -1200,7 +1220,7 @@
       </w:pPr>
       <w:r>
         <w:rPr/>
-        <w:t>Table 13: Simulated spike results (monthly cost, test)</w:t>
+        <w:t>Table 13: Live results: latency, errors and routing</w:t>
       </w:r>
     </w:p>
     <w:p>
@@ -1210,7 +1230,37 @@
       </w:pPr>
       <w:r>
         <w:rPr/>
-        <w:t>Table 14: Key parameters</w:t>
+        <w:t>Table 14: Live results: backend latency, resources, cost and energy estimate</w:t>
+      </w:r>
+    </w:p>
+    <w:p>
+      <w:pPr>
+        <w:spacing w:after="40" w:line="276" w:lineRule="auto"/>
+        <w:ind w:left="0"/>
+      </w:pPr>
+      <w:r>
+        <w:rPr/>
+        <w:t>Table 15: Reconciliation: live arms against a simulator replay of the same arm</w:t>
+      </w:r>
+    </w:p>
+    <w:p>
+      <w:pPr>
+        <w:spacing w:after="40" w:line="276" w:lineRule="auto"/>
+        <w:ind w:left="0"/>
+      </w:pPr>
+      <w:r>
+        <w:rPr/>
+        <w:t>Table 16: Simulated spike results (monthly cost, test)</w:t>
+      </w:r>
+    </w:p>
+    <w:p>
+      <w:pPr>
+        <w:spacing w:after="40" w:line="276" w:lineRule="auto"/>
+        <w:ind w:left="0"/>
+      </w:pPr>
+      <w:r>
+        <w:rPr/>
+        <w:t>Table 17: Key parameters</w:t>
       </w:r>
     </w:p>
     <w:p>
@@ -2723,7 +2773,7 @@
       </w:pPr>
       <w:r>
         <w:rPr/>
-        <w:t>With the measured capacity the median q* across the simulated functions is 0.49 and no function has q* = 0. A direct sweep of the quantile level on validation (Table 11) shows that the theoretical level is the cheapest of the levels tried.</w:t>
+        <w:t>With the measured capacity the median q* across the simulated functions is 0.49 and no function has q* = 0. A direct sweep of the quantile level on validation (Table 12) shows that the theoretical level is the cheapest of the levels tried.</w:t>
       </w:r>
     </w:p>
     <w:p>
@@ -9813,7 +9863,7 @@
       </w:pPr>
       <w:r>
         <w:rPr/>
-        <w:t>The hybrids are the only strategies with no unserved load and the lowest cost. Hybrid-rolling costs $32.2k per month, 41% below all-Lambda ($54.6k) and 14% below the cheapest reactive setting (u = 0.7, $37.5k), which also drops 9.2% of the load. Lowering u reduces unserved load only slowly and raises cost steeply: u = 0.3 costs $87.5k and still drops 6.8%, because a reactive controller sized from five-minute-old load cannot follow a rising minute-by-minute load at any utilisation target. The seasonal emulation drops less load than reactive but costs more at every u, because capacity set from the past maximum of the same hour is high all hour. Peak-sizing costs $873.0k and still drops 0.49% on test days because the test peak exceeded the training peak.</w:t>
+        <w:t>The hybrids are the only strategies with no unserved load and the lowest cost. Hybrid-rolling costs $32.2k per month, 41% below all-Lambda ($54.6k) and 14% below the cheapest reactive setting (u = 0.7, $37.5k), which also drops 9.2% of the load. Lowering u reduces unserved load only slowly and raises cost steeply: u = 0.3 costs $87.5k and still drops 6.8%, which is consistent with a controller that sizes capacity from load five minutes old and has no fallback for load that arrives in the meantime. The seasonal emulation drops less load than reactive but costs more at every u, because capacity set from the past maximum of the same hour is high all hour. Peak-sizing costs $873.0k and still drops 0.49% on test days because the test peak exceeded the training peak.</w:t>
       </w:r>
     </w:p>
     <w:p>
@@ -10415,7 +10465,7 @@
       </w:r>
       <w:r>
         <w:rPr/>
-        <w:t xml:space="preserve"> On validation LightGBM is 2.2% cheaper than rolling 6 h; on test it is 0.25% cheaper, a difference well inside what the sweeps over assumptions move. The whole gap from rolling 6 h to the hindsight oracle is only 5.4% of cost, which is the most any forecaster could gain on this population. Better accuracy at the upper quantiles shows up as a small gain, but it is bought with a higher Lambda share on test (0.25 against 0.22) and is not robust. Under the originally assumed capacity of 16 the same comparison gave -4.1% with 11.6% headroom, which is consistent with the preliminary exploration that suggested about 10% headroom. The practical conclusion is that the newsvendor rule, not the sophistication of the forecaster, delivers most of the benefit; a rolling quantile captures nearly all of it.</w:t>
+        <w:t xml:space="preserve"> On validation LightGBM is 2.2% cheaper than rolling 6 h; on test it is 0.25% cheaper, a difference well inside what the sweeps over assumptions move. The whole gap from rolling 6 h to the hindsight oracle is only 5.4% of cost, which is the most any forecaster could gain on this population. Better accuracy at the upper quantiles shows up as a small gain that shrinks from 2.2% on validation to 0.25% on test, and on test the ML base sends a larger share of load to Lambda (0.25 against 0.22). Under the originally assumed capacity of 16 the same comparison gave -4.1% with 11.6% headroom, which is consistent with the preliminary exploration that suggested about 10% headroom. The practical conclusion is that the newsvendor rule, not the sophistication of the forecaster, delivers most of the benefit; a rolling quantile captures nearly all of it.</w:t>
       </w:r>
     </w:p>
     <w:p>
@@ -10433,7 +10483,7 @@
       </w:pPr>
       <w:r>
         <w:rPr/>
-        <w:t>The simulator has no latency model. Latency is measured live (Section 8.8). The calibration gives the building blocks: an EC2 instance holds p95 near the service time up to its capacity and degrades sharply beyond it, and Lambda adds a cold-start overhead (Table 7).</w:t>
+        <w:t>The simulator has no latency model. Latency is measured live (Section 8.8). The calibration gives the building blocks: an EC2 instance holds p95 near the service time up to its capacity and degrades sharply beyond it, and Lambda adds a cold-start overhead (Table 5).</w:t>
       </w:r>
     </w:p>
     <w:p>
@@ -10489,7 +10539,7 @@
       </w:pPr>
       <w:r>
         <w:rPr/>
-        <w:t>Across functions, the ratio of hybrid-rolling cost to the best single platform has median 0.86 (5th percentile 0.47, 95th percentile 1.01); hybrid-rolling is cheaper than all-Lambda for 82% of functions. Gains are concentrated in functions with steady load; for the rest the hybrid collapses to roughly the cost of the best single platform.</w:t>
+        <w:t>Across functions, the ratio of hybrid-rolling cost to the best single platform has median 0.86 (5th percentile 0.47, 95th percentile 1.01); hybrid-rolling is cheaper than all-Lambda for 82% of functions. For roughly a quarter of the functions (75th percentile ratio 1.00) the hybrid is no cheaper than the best single platform, so the saving comes from the other three quarters; we did not analyse which load characteristics separate the two groups.</w:t>
       </w:r>
     </w:p>
     <w:p>
@@ -12079,7 +12129,3077 @@
       </w:pPr>
       <w:r>
         <w:rPr/>
-        <w:t>[LIVE RESULTS PENDING]</w:t>
+        <w:t>Four arms were run one after another against the same trace window (function 643, scale factor 6.83, peak 28 req/s) with the same seed, from a laptop in Mumbai to the load balancer in ap-south-1. One trace hour lasts 375 s, so each arm is 37.5 minutes. Arm A is ASG target tracking on CPU at 50% with all traffic to EC2. Arms B and C use the controller of Section 6 with the static and the LightGBM forecast; arm D is arm C with the load multiplied by 4 during the fourth trace hour, after the forecast for that hour had been made. Predictive scaling was skipped (Section 7.5).</w:t>
+      </w:r>
+    </w:p>
+    <w:p>
+      <w:pPr>
+        <w:keepNext/>
+        <w:spacing w:after="80" w:before="120" w:line="276" w:lineRule="auto"/>
+        <w:jc w:val="center"/>
+      </w:pPr>
+      <w:r>
+        <w:rPr>
+          <w:sz w:val="22"/>
+        </w:rPr>
+        <w:t>Table 13: Live results: latency, errors and routing</w:t>
+      </w:r>
+    </w:p>
+    <w:tbl>
+      <w:tblPr>
+        <w:tblW w:type="auto" w:w="0"/>
+        <w:tblLayout w:type="fixed"/>
+        <w:tblLook w:firstColumn="1" w:firstRow="1" w:lastColumn="0" w:lastRow="0" w:noHBand="0" w:noVBand="1" w:val="04A0"/>
+        <w:tblBorders>
+          <w:top w:val="single" w:sz="4" w:space="0" w:color="808080"/>
+          <w:left w:val="single" w:sz="4" w:space="0" w:color="808080"/>
+          <w:bottom w:val="single" w:sz="4" w:space="0" w:color="808080"/>
+          <w:right w:val="single" w:sz="4" w:space="0" w:color="808080"/>
+          <w:insideH w:val="single" w:sz="4" w:space="0" w:color="808080"/>
+          <w:insideV w:val="single" w:sz="4" w:space="0" w:color="808080"/>
+        </w:tblBorders>
+      </w:tblPr>
+      <w:tblGrid>
+        <w:gridCol w:w="1128"/>
+        <w:gridCol w:w="1128"/>
+        <w:gridCol w:w="1128"/>
+        <w:gridCol w:w="1128"/>
+        <w:gridCol w:w="1128"/>
+        <w:gridCol w:w="1128"/>
+        <w:gridCol w:w="1128"/>
+        <w:gridCol w:w="1128"/>
+      </w:tblGrid>
+      <w:tr>
+        <w:trPr>
+          <w:cantSplit/>
+          <w:tblHeader/>
+        </w:trPr>
+        <w:tc>
+          <w:tcPr>
+            <w:tcW w:type="dxa" w:w="2608"/>
+            <w:tcMar>
+              <w:top w:w="60" w:type="dxa"/>
+              <w:left w:w="100" w:type="dxa"/>
+              <w:bottom w:w="60" w:type="dxa"/>
+              <w:right w:w="100" w:type="dxa"/>
+            </w:tcMar>
+            <w:shd w:val="clear" w:color="auto" w:fill="D9D9D9"/>
+          </w:tcPr>
+          <w:p>
+            <w:pPr>
+              <w:spacing w:after="0" w:line="240" w:lineRule="auto"/>
+            </w:pPr>
+            <w:r>
+              <w:rPr>
+                <w:b/>
+                <w:sz w:val="18"/>
+              </w:rPr>
+              <w:t>Arm</w:t>
+            </w:r>
+          </w:p>
+        </w:tc>
+        <w:tc>
+          <w:tcPr>
+            <w:tcW w:type="dxa" w:w="1077"/>
+            <w:tcMar>
+              <w:top w:w="60" w:type="dxa"/>
+              <w:left w:w="100" w:type="dxa"/>
+              <w:bottom w:w="60" w:type="dxa"/>
+              <w:right w:w="100" w:type="dxa"/>
+            </w:tcMar>
+            <w:shd w:val="clear" w:color="auto" w:fill="D9D9D9"/>
+          </w:tcPr>
+          <w:p>
+            <w:pPr>
+              <w:spacing w:after="0" w:line="240" w:lineRule="auto"/>
+            </w:pPr>
+            <w:r>
+              <w:rPr>
+                <w:b/>
+                <w:sz w:val="18"/>
+              </w:rPr>
+              <w:t>Requests</w:t>
+            </w:r>
+          </w:p>
+        </w:tc>
+        <w:tc>
+          <w:tcPr>
+            <w:tcW w:type="dxa" w:w="907"/>
+            <w:tcMar>
+              <w:top w:w="60" w:type="dxa"/>
+              <w:left w:w="100" w:type="dxa"/>
+              <w:bottom w:w="60" w:type="dxa"/>
+              <w:right w:w="100" w:type="dxa"/>
+            </w:tcMar>
+            <w:shd w:val="clear" w:color="auto" w:fill="D9D9D9"/>
+          </w:tcPr>
+          <w:p>
+            <w:pPr>
+              <w:spacing w:after="0" w:line="240" w:lineRule="auto"/>
+            </w:pPr>
+            <w:r>
+              <w:rPr>
+                <w:b/>
+                <w:sz w:val="18"/>
+              </w:rPr>
+              <w:t>Errors</w:t>
+            </w:r>
+          </w:p>
+        </w:tc>
+        <w:tc>
+          <w:tcPr>
+            <w:tcW w:type="dxa" w:w="1134"/>
+            <w:tcMar>
+              <w:top w:w="60" w:type="dxa"/>
+              <w:left w:w="100" w:type="dxa"/>
+              <w:bottom w:w="60" w:type="dxa"/>
+              <w:right w:w="100" w:type="dxa"/>
+            </w:tcMar>
+            <w:shd w:val="clear" w:color="auto" w:fill="D9D9D9"/>
+          </w:tcPr>
+          <w:p>
+            <w:pPr>
+              <w:spacing w:after="0" w:line="240" w:lineRule="auto"/>
+            </w:pPr>
+            <w:r>
+              <w:rPr>
+                <w:b/>
+                <w:sz w:val="18"/>
+              </w:rPr>
+              <w:t>Lambda share</w:t>
+            </w:r>
+          </w:p>
+        </w:tc>
+        <w:tc>
+          <w:tcPr>
+            <w:tcW w:type="dxa" w:w="737"/>
+            <w:tcMar>
+              <w:top w:w="60" w:type="dxa"/>
+              <w:left w:w="100" w:type="dxa"/>
+              <w:bottom w:w="60" w:type="dxa"/>
+              <w:right w:w="100" w:type="dxa"/>
+            </w:tcMar>
+            <w:shd w:val="clear" w:color="auto" w:fill="D9D9D9"/>
+          </w:tcPr>
+          <w:p>
+            <w:pPr>
+              <w:spacing w:after="0" w:line="240" w:lineRule="auto"/>
+            </w:pPr>
+            <w:r>
+              <w:rPr>
+                <w:b/>
+                <w:sz w:val="18"/>
+              </w:rPr>
+              <w:t>p50 ms</w:t>
+            </w:r>
+          </w:p>
+        </w:tc>
+        <w:tc>
+          <w:tcPr>
+            <w:tcW w:type="dxa" w:w="737"/>
+            <w:tcMar>
+              <w:top w:w="60" w:type="dxa"/>
+              <w:left w:w="100" w:type="dxa"/>
+              <w:bottom w:w="60" w:type="dxa"/>
+              <w:right w:w="100" w:type="dxa"/>
+            </w:tcMar>
+            <w:shd w:val="clear" w:color="auto" w:fill="D9D9D9"/>
+          </w:tcPr>
+          <w:p>
+            <w:pPr>
+              <w:spacing w:after="0" w:line="240" w:lineRule="auto"/>
+            </w:pPr>
+            <w:r>
+              <w:rPr>
+                <w:b/>
+                <w:sz w:val="18"/>
+              </w:rPr>
+              <w:t>p95 ms</w:t>
+            </w:r>
+          </w:p>
+        </w:tc>
+        <w:tc>
+          <w:tcPr>
+            <w:tcW w:type="dxa" w:w="737"/>
+            <w:tcMar>
+              <w:top w:w="60" w:type="dxa"/>
+              <w:left w:w="100" w:type="dxa"/>
+              <w:bottom w:w="60" w:type="dxa"/>
+              <w:right w:w="100" w:type="dxa"/>
+            </w:tcMar>
+            <w:shd w:val="clear" w:color="auto" w:fill="D9D9D9"/>
+          </w:tcPr>
+          <w:p>
+            <w:pPr>
+              <w:spacing w:after="0" w:line="240" w:lineRule="auto"/>
+            </w:pPr>
+            <w:r>
+              <w:rPr>
+                <w:b/>
+                <w:sz w:val="18"/>
+              </w:rPr>
+              <w:t>p99 ms</w:t>
+            </w:r>
+          </w:p>
+        </w:tc>
+        <w:tc>
+          <w:tcPr>
+            <w:tcW w:type="dxa" w:w="1304"/>
+            <w:tcMar>
+              <w:top w:w="60" w:type="dxa"/>
+              <w:left w:w="100" w:type="dxa"/>
+              <w:bottom w:w="60" w:type="dxa"/>
+              <w:right w:w="100" w:type="dxa"/>
+            </w:tcMar>
+            <w:shd w:val="clear" w:color="auto" w:fill="D9D9D9"/>
+          </w:tcPr>
+          <w:p>
+            <w:pPr>
+              <w:spacing w:after="0" w:line="240" w:lineRule="auto"/>
+            </w:pPr>
+            <w:r>
+              <w:rPr>
+                <w:b/>
+                <w:sz w:val="18"/>
+              </w:rPr>
+              <w:t>Over 800 ms or failed</w:t>
+            </w:r>
+          </w:p>
+        </w:tc>
+      </w:tr>
+      <w:tr>
+        <w:trPr>
+          <w:cantSplit/>
+        </w:trPr>
+        <w:tc>
+          <w:tcPr>
+            <w:tcW w:type="dxa" w:w="2608"/>
+            <w:tcMar>
+              <w:top w:w="60" w:type="dxa"/>
+              <w:left w:w="100" w:type="dxa"/>
+              <w:bottom w:w="60" w:type="dxa"/>
+              <w:right w:w="100" w:type="dxa"/>
+            </w:tcMar>
+          </w:tcPr>
+          <w:p>
+            <w:pPr>
+              <w:spacing w:after="0" w:line="240" w:lineRule="auto"/>
+            </w:pPr>
+            <w:r>
+              <w:rPr>
+                <w:sz w:val="18"/>
+              </w:rPr>
+              <w:t>A reactive (ASG target tracking)</w:t>
+            </w:r>
+          </w:p>
+        </w:tc>
+        <w:tc>
+          <w:tcPr>
+            <w:tcW w:type="dxa" w:w="1077"/>
+            <w:tcMar>
+              <w:top w:w="60" w:type="dxa"/>
+              <w:left w:w="100" w:type="dxa"/>
+              <w:bottom w:w="60" w:type="dxa"/>
+              <w:right w:w="100" w:type="dxa"/>
+            </w:tcMar>
+          </w:tcPr>
+          <w:p>
+            <w:pPr>
+              <w:spacing w:after="0" w:line="240" w:lineRule="auto"/>
+              <w:jc w:val="right"/>
+            </w:pPr>
+            <w:r>
+              <w:rPr>
+                <w:sz w:val="18"/>
+              </w:rPr>
+              <w:t>23,511</w:t>
+            </w:r>
+          </w:p>
+        </w:tc>
+        <w:tc>
+          <w:tcPr>
+            <w:tcW w:type="dxa" w:w="907"/>
+            <w:tcMar>
+              <w:top w:w="60" w:type="dxa"/>
+              <w:left w:w="100" w:type="dxa"/>
+              <w:bottom w:w="60" w:type="dxa"/>
+              <w:right w:w="100" w:type="dxa"/>
+            </w:tcMar>
+          </w:tcPr>
+          <w:p>
+            <w:pPr>
+              <w:spacing w:after="0" w:line="240" w:lineRule="auto"/>
+              <w:jc w:val="right"/>
+            </w:pPr>
+            <w:r>
+              <w:rPr>
+                <w:sz w:val="18"/>
+              </w:rPr>
+              <w:t>0.1%</w:t>
+            </w:r>
+          </w:p>
+        </w:tc>
+        <w:tc>
+          <w:tcPr>
+            <w:tcW w:type="dxa" w:w="1134"/>
+            <w:tcMar>
+              <w:top w:w="60" w:type="dxa"/>
+              <w:left w:w="100" w:type="dxa"/>
+              <w:bottom w:w="60" w:type="dxa"/>
+              <w:right w:w="100" w:type="dxa"/>
+            </w:tcMar>
+          </w:tcPr>
+          <w:p>
+            <w:pPr>
+              <w:spacing w:after="0" w:line="240" w:lineRule="auto"/>
+              <w:jc w:val="right"/>
+            </w:pPr>
+            <w:r>
+              <w:rPr>
+                <w:sz w:val="18"/>
+              </w:rPr>
+              <w:t>0.2%</w:t>
+            </w:r>
+          </w:p>
+        </w:tc>
+        <w:tc>
+          <w:tcPr>
+            <w:tcW w:type="dxa" w:w="737"/>
+            <w:tcMar>
+              <w:top w:w="60" w:type="dxa"/>
+              <w:left w:w="100" w:type="dxa"/>
+              <w:bottom w:w="60" w:type="dxa"/>
+              <w:right w:w="100" w:type="dxa"/>
+            </w:tcMar>
+          </w:tcPr>
+          <w:p>
+            <w:pPr>
+              <w:spacing w:after="0" w:line="240" w:lineRule="auto"/>
+              <w:jc w:val="right"/>
+            </w:pPr>
+            <w:r>
+              <w:rPr>
+                <w:sz w:val="18"/>
+              </w:rPr>
+              <w:t>445</w:t>
+            </w:r>
+          </w:p>
+        </w:tc>
+        <w:tc>
+          <w:tcPr>
+            <w:tcW w:type="dxa" w:w="737"/>
+            <w:tcMar>
+              <w:top w:w="60" w:type="dxa"/>
+              <w:left w:w="100" w:type="dxa"/>
+              <w:bottom w:w="60" w:type="dxa"/>
+              <w:right w:w="100" w:type="dxa"/>
+            </w:tcMar>
+          </w:tcPr>
+          <w:p>
+            <w:pPr>
+              <w:spacing w:after="0" w:line="240" w:lineRule="auto"/>
+              <w:jc w:val="right"/>
+            </w:pPr>
+            <w:r>
+              <w:rPr>
+                <w:sz w:val="18"/>
+              </w:rPr>
+              <w:t>566</w:t>
+            </w:r>
+          </w:p>
+        </w:tc>
+        <w:tc>
+          <w:tcPr>
+            <w:tcW w:type="dxa" w:w="737"/>
+            <w:tcMar>
+              <w:top w:w="60" w:type="dxa"/>
+              <w:left w:w="100" w:type="dxa"/>
+              <w:bottom w:w="60" w:type="dxa"/>
+              <w:right w:w="100" w:type="dxa"/>
+            </w:tcMar>
+          </w:tcPr>
+          <w:p>
+            <w:pPr>
+              <w:spacing w:after="0" w:line="240" w:lineRule="auto"/>
+              <w:jc w:val="right"/>
+            </w:pPr>
+            <w:r>
+              <w:rPr>
+                <w:sz w:val="18"/>
+              </w:rPr>
+              <w:t>809</w:t>
+            </w:r>
+          </w:p>
+        </w:tc>
+        <w:tc>
+          <w:tcPr>
+            <w:tcW w:type="dxa" w:w="1304"/>
+            <w:tcMar>
+              <w:top w:w="60" w:type="dxa"/>
+              <w:left w:w="100" w:type="dxa"/>
+              <w:bottom w:w="60" w:type="dxa"/>
+              <w:right w:w="100" w:type="dxa"/>
+            </w:tcMar>
+          </w:tcPr>
+          <w:p>
+            <w:pPr>
+              <w:spacing w:after="0" w:line="240" w:lineRule="auto"/>
+              <w:jc w:val="right"/>
+            </w:pPr>
+            <w:r>
+              <w:rPr>
+                <w:sz w:val="18"/>
+              </w:rPr>
+              <w:t>1.2%</w:t>
+            </w:r>
+          </w:p>
+        </w:tc>
+      </w:tr>
+      <w:tr>
+        <w:trPr>
+          <w:cantSplit/>
+        </w:trPr>
+        <w:tc>
+          <w:tcPr>
+            <w:tcW w:type="dxa" w:w="2608"/>
+            <w:tcMar>
+              <w:top w:w="60" w:type="dxa"/>
+              <w:left w:w="100" w:type="dxa"/>
+              <w:bottom w:w="60" w:type="dxa"/>
+              <w:right w:w="100" w:type="dxa"/>
+            </w:tcMar>
+          </w:tcPr>
+          <w:p>
+            <w:pPr>
+              <w:spacing w:after="0" w:line="240" w:lineRule="auto"/>
+            </w:pPr>
+            <w:r>
+              <w:rPr>
+                <w:sz w:val="18"/>
+              </w:rPr>
+              <w:t>B hybrid-static</w:t>
+            </w:r>
+          </w:p>
+        </w:tc>
+        <w:tc>
+          <w:tcPr>
+            <w:tcW w:type="dxa" w:w="1077"/>
+            <w:tcMar>
+              <w:top w:w="60" w:type="dxa"/>
+              <w:left w:w="100" w:type="dxa"/>
+              <w:bottom w:w="60" w:type="dxa"/>
+              <w:right w:w="100" w:type="dxa"/>
+            </w:tcMar>
+          </w:tcPr>
+          <w:p>
+            <w:pPr>
+              <w:spacing w:after="0" w:line="240" w:lineRule="auto"/>
+              <w:jc w:val="right"/>
+            </w:pPr>
+            <w:r>
+              <w:rPr>
+                <w:sz w:val="18"/>
+              </w:rPr>
+              <w:t>23,688</w:t>
+            </w:r>
+          </w:p>
+        </w:tc>
+        <w:tc>
+          <w:tcPr>
+            <w:tcW w:type="dxa" w:w="907"/>
+            <w:tcMar>
+              <w:top w:w="60" w:type="dxa"/>
+              <w:left w:w="100" w:type="dxa"/>
+              <w:bottom w:w="60" w:type="dxa"/>
+              <w:right w:w="100" w:type="dxa"/>
+            </w:tcMar>
+          </w:tcPr>
+          <w:p>
+            <w:pPr>
+              <w:spacing w:after="0" w:line="240" w:lineRule="auto"/>
+              <w:jc w:val="right"/>
+            </w:pPr>
+            <w:r>
+              <w:rPr>
+                <w:sz w:val="18"/>
+              </w:rPr>
+              <w:t>0.0%</w:t>
+            </w:r>
+          </w:p>
+        </w:tc>
+        <w:tc>
+          <w:tcPr>
+            <w:tcW w:type="dxa" w:w="1134"/>
+            <w:tcMar>
+              <w:top w:w="60" w:type="dxa"/>
+              <w:left w:w="100" w:type="dxa"/>
+              <w:bottom w:w="60" w:type="dxa"/>
+              <w:right w:w="100" w:type="dxa"/>
+            </w:tcMar>
+          </w:tcPr>
+          <w:p>
+            <w:pPr>
+              <w:spacing w:after="0" w:line="240" w:lineRule="auto"/>
+              <w:jc w:val="right"/>
+            </w:pPr>
+            <w:r>
+              <w:rPr>
+                <w:sz w:val="18"/>
+              </w:rPr>
+              <w:t>0.7%</w:t>
+            </w:r>
+          </w:p>
+        </w:tc>
+        <w:tc>
+          <w:tcPr>
+            <w:tcW w:type="dxa" w:w="737"/>
+            <w:tcMar>
+              <w:top w:w="60" w:type="dxa"/>
+              <w:left w:w="100" w:type="dxa"/>
+              <w:bottom w:w="60" w:type="dxa"/>
+              <w:right w:w="100" w:type="dxa"/>
+            </w:tcMar>
+          </w:tcPr>
+          <w:p>
+            <w:pPr>
+              <w:spacing w:after="0" w:line="240" w:lineRule="auto"/>
+              <w:jc w:val="right"/>
+            </w:pPr>
+            <w:r>
+              <w:rPr>
+                <w:sz w:val="18"/>
+              </w:rPr>
+              <w:t>437</w:t>
+            </w:r>
+          </w:p>
+        </w:tc>
+        <w:tc>
+          <w:tcPr>
+            <w:tcW w:type="dxa" w:w="737"/>
+            <w:tcMar>
+              <w:top w:w="60" w:type="dxa"/>
+              <w:left w:w="100" w:type="dxa"/>
+              <w:bottom w:w="60" w:type="dxa"/>
+              <w:right w:w="100" w:type="dxa"/>
+            </w:tcMar>
+          </w:tcPr>
+          <w:p>
+            <w:pPr>
+              <w:spacing w:after="0" w:line="240" w:lineRule="auto"/>
+              <w:jc w:val="right"/>
+            </w:pPr>
+            <w:r>
+              <w:rPr>
+                <w:sz w:val="18"/>
+              </w:rPr>
+              <w:t>517</w:t>
+            </w:r>
+          </w:p>
+        </w:tc>
+        <w:tc>
+          <w:tcPr>
+            <w:tcW w:type="dxa" w:w="737"/>
+            <w:tcMar>
+              <w:top w:w="60" w:type="dxa"/>
+              <w:left w:w="100" w:type="dxa"/>
+              <w:bottom w:w="60" w:type="dxa"/>
+              <w:right w:w="100" w:type="dxa"/>
+            </w:tcMar>
+          </w:tcPr>
+          <w:p>
+            <w:pPr>
+              <w:spacing w:after="0" w:line="240" w:lineRule="auto"/>
+              <w:jc w:val="right"/>
+            </w:pPr>
+            <w:r>
+              <w:rPr>
+                <w:sz w:val="18"/>
+              </w:rPr>
+              <w:t>610</w:t>
+            </w:r>
+          </w:p>
+        </w:tc>
+        <w:tc>
+          <w:tcPr>
+            <w:tcW w:type="dxa" w:w="1304"/>
+            <w:tcMar>
+              <w:top w:w="60" w:type="dxa"/>
+              <w:left w:w="100" w:type="dxa"/>
+              <w:bottom w:w="60" w:type="dxa"/>
+              <w:right w:w="100" w:type="dxa"/>
+            </w:tcMar>
+          </w:tcPr>
+          <w:p>
+            <w:pPr>
+              <w:spacing w:after="0" w:line="240" w:lineRule="auto"/>
+              <w:jc w:val="right"/>
+            </w:pPr>
+            <w:r>
+              <w:rPr>
+                <w:sz w:val="18"/>
+              </w:rPr>
+              <w:t>0.2%</w:t>
+            </w:r>
+          </w:p>
+        </w:tc>
+      </w:tr>
+      <w:tr>
+        <w:trPr>
+          <w:cantSplit/>
+        </w:trPr>
+        <w:tc>
+          <w:tcPr>
+            <w:tcW w:type="dxa" w:w="2608"/>
+            <w:tcMar>
+              <w:top w:w="60" w:type="dxa"/>
+              <w:left w:w="100" w:type="dxa"/>
+              <w:bottom w:w="60" w:type="dxa"/>
+              <w:right w:w="100" w:type="dxa"/>
+            </w:tcMar>
+          </w:tcPr>
+          <w:p>
+            <w:pPr>
+              <w:spacing w:after="0" w:line="240" w:lineRule="auto"/>
+            </w:pPr>
+            <w:r>
+              <w:rPr>
+                <w:sz w:val="18"/>
+              </w:rPr>
+              <w:t>C hybrid-ML</w:t>
+            </w:r>
+          </w:p>
+        </w:tc>
+        <w:tc>
+          <w:tcPr>
+            <w:tcW w:type="dxa" w:w="1077"/>
+            <w:tcMar>
+              <w:top w:w="60" w:type="dxa"/>
+              <w:left w:w="100" w:type="dxa"/>
+              <w:bottom w:w="60" w:type="dxa"/>
+              <w:right w:w="100" w:type="dxa"/>
+            </w:tcMar>
+          </w:tcPr>
+          <w:p>
+            <w:pPr>
+              <w:spacing w:after="0" w:line="240" w:lineRule="auto"/>
+              <w:jc w:val="right"/>
+            </w:pPr>
+            <w:r>
+              <w:rPr>
+                <w:sz w:val="18"/>
+              </w:rPr>
+              <w:t>23,685</w:t>
+            </w:r>
+          </w:p>
+        </w:tc>
+        <w:tc>
+          <w:tcPr>
+            <w:tcW w:type="dxa" w:w="907"/>
+            <w:tcMar>
+              <w:top w:w="60" w:type="dxa"/>
+              <w:left w:w="100" w:type="dxa"/>
+              <w:bottom w:w="60" w:type="dxa"/>
+              <w:right w:w="100" w:type="dxa"/>
+            </w:tcMar>
+          </w:tcPr>
+          <w:p>
+            <w:pPr>
+              <w:spacing w:after="0" w:line="240" w:lineRule="auto"/>
+              <w:jc w:val="right"/>
+            </w:pPr>
+            <w:r>
+              <w:rPr>
+                <w:sz w:val="18"/>
+              </w:rPr>
+              <w:t>0.0%</w:t>
+            </w:r>
+          </w:p>
+        </w:tc>
+        <w:tc>
+          <w:tcPr>
+            <w:tcW w:type="dxa" w:w="1134"/>
+            <w:tcMar>
+              <w:top w:w="60" w:type="dxa"/>
+              <w:left w:w="100" w:type="dxa"/>
+              <w:bottom w:w="60" w:type="dxa"/>
+              <w:right w:w="100" w:type="dxa"/>
+            </w:tcMar>
+          </w:tcPr>
+          <w:p>
+            <w:pPr>
+              <w:spacing w:after="0" w:line="240" w:lineRule="auto"/>
+              <w:jc w:val="right"/>
+            </w:pPr>
+            <w:r>
+              <w:rPr>
+                <w:sz w:val="18"/>
+              </w:rPr>
+              <w:t>0.5%</w:t>
+            </w:r>
+          </w:p>
+        </w:tc>
+        <w:tc>
+          <w:tcPr>
+            <w:tcW w:type="dxa" w:w="737"/>
+            <w:tcMar>
+              <w:top w:w="60" w:type="dxa"/>
+              <w:left w:w="100" w:type="dxa"/>
+              <w:bottom w:w="60" w:type="dxa"/>
+              <w:right w:w="100" w:type="dxa"/>
+            </w:tcMar>
+          </w:tcPr>
+          <w:p>
+            <w:pPr>
+              <w:spacing w:after="0" w:line="240" w:lineRule="auto"/>
+              <w:jc w:val="right"/>
+            </w:pPr>
+            <w:r>
+              <w:rPr>
+                <w:sz w:val="18"/>
+              </w:rPr>
+              <w:t>445</w:t>
+            </w:r>
+          </w:p>
+        </w:tc>
+        <w:tc>
+          <w:tcPr>
+            <w:tcW w:type="dxa" w:w="737"/>
+            <w:tcMar>
+              <w:top w:w="60" w:type="dxa"/>
+              <w:left w:w="100" w:type="dxa"/>
+              <w:bottom w:w="60" w:type="dxa"/>
+              <w:right w:w="100" w:type="dxa"/>
+            </w:tcMar>
+          </w:tcPr>
+          <w:p>
+            <w:pPr>
+              <w:spacing w:after="0" w:line="240" w:lineRule="auto"/>
+              <w:jc w:val="right"/>
+            </w:pPr>
+            <w:r>
+              <w:rPr>
+                <w:sz w:val="18"/>
+              </w:rPr>
+              <w:t>585</w:t>
+            </w:r>
+          </w:p>
+        </w:tc>
+        <w:tc>
+          <w:tcPr>
+            <w:tcW w:type="dxa" w:w="737"/>
+            <w:tcMar>
+              <w:top w:w="60" w:type="dxa"/>
+              <w:left w:w="100" w:type="dxa"/>
+              <w:bottom w:w="60" w:type="dxa"/>
+              <w:right w:w="100" w:type="dxa"/>
+            </w:tcMar>
+          </w:tcPr>
+          <w:p>
+            <w:pPr>
+              <w:spacing w:after="0" w:line="240" w:lineRule="auto"/>
+              <w:jc w:val="right"/>
+            </w:pPr>
+            <w:r>
+              <w:rPr>
+                <w:sz w:val="18"/>
+              </w:rPr>
+              <w:t>851</w:t>
+            </w:r>
+          </w:p>
+        </w:tc>
+        <w:tc>
+          <w:tcPr>
+            <w:tcW w:type="dxa" w:w="1304"/>
+            <w:tcMar>
+              <w:top w:w="60" w:type="dxa"/>
+              <w:left w:w="100" w:type="dxa"/>
+              <w:bottom w:w="60" w:type="dxa"/>
+              <w:right w:w="100" w:type="dxa"/>
+            </w:tcMar>
+          </w:tcPr>
+          <w:p>
+            <w:pPr>
+              <w:spacing w:after="0" w:line="240" w:lineRule="auto"/>
+              <w:jc w:val="right"/>
+            </w:pPr>
+            <w:r>
+              <w:rPr>
+                <w:sz w:val="18"/>
+              </w:rPr>
+              <w:t>1.3%</w:t>
+            </w:r>
+          </w:p>
+        </w:tc>
+      </w:tr>
+      <w:tr>
+        <w:trPr>
+          <w:cantSplit/>
+        </w:trPr>
+        <w:tc>
+          <w:tcPr>
+            <w:tcW w:type="dxa" w:w="2608"/>
+            <w:tcMar>
+              <w:top w:w="60" w:type="dxa"/>
+              <w:left w:w="100" w:type="dxa"/>
+              <w:bottom w:w="60" w:type="dxa"/>
+              <w:right w:w="100" w:type="dxa"/>
+            </w:tcMar>
+          </w:tcPr>
+          <w:p>
+            <w:pPr>
+              <w:spacing w:after="0" w:line="240" w:lineRule="auto"/>
+            </w:pPr>
+            <w:r>
+              <w:rPr>
+                <w:sz w:val="18"/>
+              </w:rPr>
+              <w:t>D hybrid-ML + x4 spike</w:t>
+            </w:r>
+          </w:p>
+        </w:tc>
+        <w:tc>
+          <w:tcPr>
+            <w:tcW w:type="dxa" w:w="1077"/>
+            <w:tcMar>
+              <w:top w:w="60" w:type="dxa"/>
+              <w:left w:w="100" w:type="dxa"/>
+              <w:bottom w:w="60" w:type="dxa"/>
+              <w:right w:w="100" w:type="dxa"/>
+            </w:tcMar>
+          </w:tcPr>
+          <w:p>
+            <w:pPr>
+              <w:spacing w:after="0" w:line="240" w:lineRule="auto"/>
+              <w:jc w:val="right"/>
+            </w:pPr>
+            <w:r>
+              <w:rPr>
+                <w:sz w:val="18"/>
+              </w:rPr>
+              <w:t>30,988</w:t>
+            </w:r>
+          </w:p>
+        </w:tc>
+        <w:tc>
+          <w:tcPr>
+            <w:tcW w:type="dxa" w:w="907"/>
+            <w:tcMar>
+              <w:top w:w="60" w:type="dxa"/>
+              <w:left w:w="100" w:type="dxa"/>
+              <w:bottom w:w="60" w:type="dxa"/>
+              <w:right w:w="100" w:type="dxa"/>
+            </w:tcMar>
+          </w:tcPr>
+          <w:p>
+            <w:pPr>
+              <w:spacing w:after="0" w:line="240" w:lineRule="auto"/>
+              <w:jc w:val="right"/>
+            </w:pPr>
+            <w:r>
+              <w:rPr>
+                <w:sz w:val="18"/>
+              </w:rPr>
+              <w:t>0.0%</w:t>
+            </w:r>
+          </w:p>
+        </w:tc>
+        <w:tc>
+          <w:tcPr>
+            <w:tcW w:type="dxa" w:w="1134"/>
+            <w:tcMar>
+              <w:top w:w="60" w:type="dxa"/>
+              <w:left w:w="100" w:type="dxa"/>
+              <w:bottom w:w="60" w:type="dxa"/>
+              <w:right w:w="100" w:type="dxa"/>
+            </w:tcMar>
+          </w:tcPr>
+          <w:p>
+            <w:pPr>
+              <w:spacing w:after="0" w:line="240" w:lineRule="auto"/>
+              <w:jc w:val="right"/>
+            </w:pPr>
+            <w:r>
+              <w:rPr>
+                <w:sz w:val="18"/>
+              </w:rPr>
+              <w:t>20.0%</w:t>
+            </w:r>
+          </w:p>
+        </w:tc>
+        <w:tc>
+          <w:tcPr>
+            <w:tcW w:type="dxa" w:w="737"/>
+            <w:tcMar>
+              <w:top w:w="60" w:type="dxa"/>
+              <w:left w:w="100" w:type="dxa"/>
+              <w:bottom w:w="60" w:type="dxa"/>
+              <w:right w:w="100" w:type="dxa"/>
+            </w:tcMar>
+          </w:tcPr>
+          <w:p>
+            <w:pPr>
+              <w:spacing w:after="0" w:line="240" w:lineRule="auto"/>
+              <w:jc w:val="right"/>
+            </w:pPr>
+            <w:r>
+              <w:rPr>
+                <w:sz w:val="18"/>
+              </w:rPr>
+              <w:t>454</w:t>
+            </w:r>
+          </w:p>
+        </w:tc>
+        <w:tc>
+          <w:tcPr>
+            <w:tcW w:type="dxa" w:w="737"/>
+            <w:tcMar>
+              <w:top w:w="60" w:type="dxa"/>
+              <w:left w:w="100" w:type="dxa"/>
+              <w:bottom w:w="60" w:type="dxa"/>
+              <w:right w:w="100" w:type="dxa"/>
+            </w:tcMar>
+          </w:tcPr>
+          <w:p>
+            <w:pPr>
+              <w:spacing w:after="0" w:line="240" w:lineRule="auto"/>
+              <w:jc w:val="right"/>
+            </w:pPr>
+            <w:r>
+              <w:rPr>
+                <w:sz w:val="18"/>
+              </w:rPr>
+              <w:t>2618</w:t>
+            </w:r>
+          </w:p>
+        </w:tc>
+        <w:tc>
+          <w:tcPr>
+            <w:tcW w:type="dxa" w:w="737"/>
+            <w:tcMar>
+              <w:top w:w="60" w:type="dxa"/>
+              <w:left w:w="100" w:type="dxa"/>
+              <w:bottom w:w="60" w:type="dxa"/>
+              <w:right w:w="100" w:type="dxa"/>
+            </w:tcMar>
+          </w:tcPr>
+          <w:p>
+            <w:pPr>
+              <w:spacing w:after="0" w:line="240" w:lineRule="auto"/>
+              <w:jc w:val="right"/>
+            </w:pPr>
+            <w:r>
+              <w:rPr>
+                <w:sz w:val="18"/>
+              </w:rPr>
+              <w:t>3666</w:t>
+            </w:r>
+          </w:p>
+        </w:tc>
+        <w:tc>
+          <w:tcPr>
+            <w:tcW w:type="dxa" w:w="1304"/>
+            <w:tcMar>
+              <w:top w:w="60" w:type="dxa"/>
+              <w:left w:w="100" w:type="dxa"/>
+              <w:bottom w:w="60" w:type="dxa"/>
+              <w:right w:w="100" w:type="dxa"/>
+            </w:tcMar>
+          </w:tcPr>
+          <w:p>
+            <w:pPr>
+              <w:spacing w:after="0" w:line="240" w:lineRule="auto"/>
+              <w:jc w:val="right"/>
+            </w:pPr>
+            <w:r>
+              <w:rPr>
+                <w:sz w:val="18"/>
+              </w:rPr>
+              <w:t>19.8%</w:t>
+            </w:r>
+          </w:p>
+        </w:tc>
+      </w:tr>
+    </w:tbl>
+    <w:p>
+      <w:pPr>
+        <w:spacing w:after="120"/>
+      </w:pPr>
+    </w:p>
+    <w:p>
+      <w:pPr>
+        <w:keepNext/>
+        <w:spacing w:after="80" w:before="120" w:line="276" w:lineRule="auto"/>
+        <w:jc w:val="center"/>
+      </w:pPr>
+      <w:r>
+        <w:rPr>
+          <w:sz w:val="22"/>
+        </w:rPr>
+        <w:t>Table 14: Live results: backend latency, resources, cost and energy estimate</w:t>
+      </w:r>
+    </w:p>
+    <w:tbl>
+      <w:tblPr>
+        <w:tblW w:type="auto" w:w="0"/>
+        <w:tblLayout w:type="fixed"/>
+        <w:tblLook w:firstColumn="1" w:firstRow="1" w:lastColumn="0" w:lastRow="0" w:noHBand="0" w:noVBand="1" w:val="04A0"/>
+        <w:tblBorders>
+          <w:top w:val="single" w:sz="4" w:space="0" w:color="808080"/>
+          <w:left w:val="single" w:sz="4" w:space="0" w:color="808080"/>
+          <w:bottom w:val="single" w:sz="4" w:space="0" w:color="808080"/>
+          <w:right w:val="single" w:sz="4" w:space="0" w:color="808080"/>
+          <w:insideH w:val="single" w:sz="4" w:space="0" w:color="808080"/>
+          <w:insideV w:val="single" w:sz="4" w:space="0" w:color="808080"/>
+        </w:tblBorders>
+      </w:tblPr>
+      <w:tblGrid>
+        <w:gridCol w:w="1128"/>
+        <w:gridCol w:w="1128"/>
+        <w:gridCol w:w="1128"/>
+        <w:gridCol w:w="1128"/>
+        <w:gridCol w:w="1128"/>
+        <w:gridCol w:w="1128"/>
+        <w:gridCol w:w="1128"/>
+        <w:gridCol w:w="1128"/>
+      </w:tblGrid>
+      <w:tr>
+        <w:trPr>
+          <w:cantSplit/>
+          <w:tblHeader/>
+        </w:trPr>
+        <w:tc>
+          <w:tcPr>
+            <w:tcW w:type="dxa" w:w="2381"/>
+            <w:tcMar>
+              <w:top w:w="60" w:type="dxa"/>
+              <w:left w:w="100" w:type="dxa"/>
+              <w:bottom w:w="60" w:type="dxa"/>
+              <w:right w:w="100" w:type="dxa"/>
+            </w:tcMar>
+            <w:shd w:val="clear" w:color="auto" w:fill="D9D9D9"/>
+          </w:tcPr>
+          <w:p>
+            <w:pPr>
+              <w:spacing w:after="0" w:line="240" w:lineRule="auto"/>
+            </w:pPr>
+            <w:r>
+              <w:rPr>
+                <w:b/>
+                <w:sz w:val="18"/>
+              </w:rPr>
+              <w:t>Arm</w:t>
+            </w:r>
+          </w:p>
+        </w:tc>
+        <w:tc>
+          <w:tcPr>
+            <w:tcW w:type="dxa" w:w="1247"/>
+            <w:tcMar>
+              <w:top w:w="60" w:type="dxa"/>
+              <w:left w:w="100" w:type="dxa"/>
+              <w:bottom w:w="60" w:type="dxa"/>
+              <w:right w:w="100" w:type="dxa"/>
+            </w:tcMar>
+            <w:shd w:val="clear" w:color="auto" w:fill="D9D9D9"/>
+          </w:tcPr>
+          <w:p>
+            <w:pPr>
+              <w:spacing w:after="0" w:line="240" w:lineRule="auto"/>
+            </w:pPr>
+            <w:r>
+              <w:rPr>
+                <w:b/>
+                <w:sz w:val="18"/>
+              </w:rPr>
+              <w:t>EC2 p50 / p95 ms</w:t>
+            </w:r>
+          </w:p>
+        </w:tc>
+        <w:tc>
+          <w:tcPr>
+            <w:tcW w:type="dxa" w:w="1361"/>
+            <w:tcMar>
+              <w:top w:w="60" w:type="dxa"/>
+              <w:left w:w="100" w:type="dxa"/>
+              <w:bottom w:w="60" w:type="dxa"/>
+              <w:right w:w="100" w:type="dxa"/>
+            </w:tcMar>
+            <w:shd w:val="clear" w:color="auto" w:fill="D9D9D9"/>
+          </w:tcPr>
+          <w:p>
+            <w:pPr>
+              <w:spacing w:after="0" w:line="240" w:lineRule="auto"/>
+            </w:pPr>
+            <w:r>
+              <w:rPr>
+                <w:b/>
+                <w:sz w:val="18"/>
+              </w:rPr>
+              <w:t>Lambda p50 / p95 ms</w:t>
+            </w:r>
+          </w:p>
+        </w:tc>
+        <w:tc>
+          <w:tcPr>
+            <w:tcW w:type="dxa" w:w="1020"/>
+            <w:tcMar>
+              <w:top w:w="60" w:type="dxa"/>
+              <w:left w:w="100" w:type="dxa"/>
+              <w:bottom w:w="60" w:type="dxa"/>
+              <w:right w:w="100" w:type="dxa"/>
+            </w:tcMar>
+            <w:shd w:val="clear" w:color="auto" w:fill="D9D9D9"/>
+          </w:tcPr>
+          <w:p>
+            <w:pPr>
+              <w:spacing w:after="0" w:line="240" w:lineRule="auto"/>
+            </w:pPr>
+            <w:r>
+              <w:rPr>
+                <w:b/>
+                <w:sz w:val="18"/>
+              </w:rPr>
+              <w:t>Instance-hours</w:t>
+            </w:r>
+          </w:p>
+        </w:tc>
+        <w:tc>
+          <w:tcPr>
+            <w:tcW w:type="dxa" w:w="850"/>
+            <w:tcMar>
+              <w:top w:w="60" w:type="dxa"/>
+              <w:left w:w="100" w:type="dxa"/>
+              <w:bottom w:w="60" w:type="dxa"/>
+              <w:right w:w="100" w:type="dxa"/>
+            </w:tcMar>
+            <w:shd w:val="clear" w:color="auto" w:fill="D9D9D9"/>
+          </w:tcPr>
+          <w:p>
+            <w:pPr>
+              <w:spacing w:after="0" w:line="240" w:lineRule="auto"/>
+            </w:pPr>
+            <w:r>
+              <w:rPr>
+                <w:b/>
+                <w:sz w:val="18"/>
+              </w:rPr>
+              <w:t>EC2 cost</w:t>
+            </w:r>
+          </w:p>
+        </w:tc>
+        <w:tc>
+          <w:tcPr>
+            <w:tcW w:type="dxa" w:w="907"/>
+            <w:tcMar>
+              <w:top w:w="60" w:type="dxa"/>
+              <w:left w:w="100" w:type="dxa"/>
+              <w:bottom w:w="60" w:type="dxa"/>
+              <w:right w:w="100" w:type="dxa"/>
+            </w:tcMar>
+            <w:shd w:val="clear" w:color="auto" w:fill="D9D9D9"/>
+          </w:tcPr>
+          <w:p>
+            <w:pPr>
+              <w:spacing w:after="0" w:line="240" w:lineRule="auto"/>
+            </w:pPr>
+            <w:r>
+              <w:rPr>
+                <w:b/>
+                <w:sz w:val="18"/>
+              </w:rPr>
+              <w:t>Lambda cost</w:t>
+            </w:r>
+          </w:p>
+        </w:tc>
+        <w:tc>
+          <w:tcPr>
+            <w:tcW w:type="dxa" w:w="850"/>
+            <w:tcMar>
+              <w:top w:w="60" w:type="dxa"/>
+              <w:left w:w="100" w:type="dxa"/>
+              <w:bottom w:w="60" w:type="dxa"/>
+              <w:right w:w="100" w:type="dxa"/>
+            </w:tcMar>
+            <w:shd w:val="clear" w:color="auto" w:fill="D9D9D9"/>
+          </w:tcPr>
+          <w:p>
+            <w:pPr>
+              <w:spacing w:after="0" w:line="240" w:lineRule="auto"/>
+            </w:pPr>
+            <w:r>
+              <w:rPr>
+                <w:b/>
+                <w:sz w:val="18"/>
+              </w:rPr>
+              <w:t>Total cost</w:t>
+            </w:r>
+          </w:p>
+        </w:tc>
+        <w:tc>
+          <w:tcPr>
+            <w:tcW w:type="dxa" w:w="1020"/>
+            <w:tcMar>
+              <w:top w:w="60" w:type="dxa"/>
+              <w:left w:w="100" w:type="dxa"/>
+              <w:bottom w:w="60" w:type="dxa"/>
+              <w:right w:w="100" w:type="dxa"/>
+            </w:tcMar>
+            <w:shd w:val="clear" w:color="auto" w:fill="D9D9D9"/>
+          </w:tcPr>
+          <w:p>
+            <w:pPr>
+              <w:spacing w:after="0" w:line="240" w:lineRule="auto"/>
+            </w:pPr>
+            <w:r>
+              <w:rPr>
+                <w:b/>
+                <w:sz w:val="18"/>
+              </w:rPr>
+              <w:t>Energy Wh (est.)</w:t>
+            </w:r>
+          </w:p>
+        </w:tc>
+      </w:tr>
+      <w:tr>
+        <w:trPr>
+          <w:cantSplit/>
+        </w:trPr>
+        <w:tc>
+          <w:tcPr>
+            <w:tcW w:type="dxa" w:w="2381"/>
+            <w:tcMar>
+              <w:top w:w="60" w:type="dxa"/>
+              <w:left w:w="100" w:type="dxa"/>
+              <w:bottom w:w="60" w:type="dxa"/>
+              <w:right w:w="100" w:type="dxa"/>
+            </w:tcMar>
+          </w:tcPr>
+          <w:p>
+            <w:pPr>
+              <w:spacing w:after="0" w:line="240" w:lineRule="auto"/>
+            </w:pPr>
+            <w:r>
+              <w:rPr>
+                <w:sz w:val="18"/>
+              </w:rPr>
+              <w:t>A reactive (ASG target tracking)</w:t>
+            </w:r>
+          </w:p>
+        </w:tc>
+        <w:tc>
+          <w:tcPr>
+            <w:tcW w:type="dxa" w:w="1247"/>
+            <w:tcMar>
+              <w:top w:w="60" w:type="dxa"/>
+              <w:left w:w="100" w:type="dxa"/>
+              <w:bottom w:w="60" w:type="dxa"/>
+              <w:right w:w="100" w:type="dxa"/>
+            </w:tcMar>
+          </w:tcPr>
+          <w:p>
+            <w:pPr>
+              <w:spacing w:after="0" w:line="240" w:lineRule="auto"/>
+            </w:pPr>
+            <w:r>
+              <w:rPr>
+                <w:sz w:val="18"/>
+              </w:rPr>
+              <w:t>445 / 565</w:t>
+            </w:r>
+          </w:p>
+        </w:tc>
+        <w:tc>
+          <w:tcPr>
+            <w:tcW w:type="dxa" w:w="1361"/>
+            <w:tcMar>
+              <w:top w:w="60" w:type="dxa"/>
+              <w:left w:w="100" w:type="dxa"/>
+              <w:bottom w:w="60" w:type="dxa"/>
+              <w:right w:w="100" w:type="dxa"/>
+            </w:tcMar>
+          </w:tcPr>
+          <w:p>
+            <w:pPr>
+              <w:spacing w:after="0" w:line="240" w:lineRule="auto"/>
+            </w:pPr>
+            <w:r>
+              <w:rPr>
+                <w:sz w:val="18"/>
+              </w:rPr>
+              <w:t>489 / 729</w:t>
+            </w:r>
+          </w:p>
+        </w:tc>
+        <w:tc>
+          <w:tcPr>
+            <w:tcW w:type="dxa" w:w="1020"/>
+            <w:tcMar>
+              <w:top w:w="60" w:type="dxa"/>
+              <w:left w:w="100" w:type="dxa"/>
+              <w:bottom w:w="60" w:type="dxa"/>
+              <w:right w:w="100" w:type="dxa"/>
+            </w:tcMar>
+          </w:tcPr>
+          <w:p>
+            <w:pPr>
+              <w:spacing w:after="0" w:line="240" w:lineRule="auto"/>
+              <w:jc w:val="right"/>
+            </w:pPr>
+            <w:r>
+              <w:rPr>
+                <w:sz w:val="18"/>
+              </w:rPr>
+              <w:t>0.838</w:t>
+            </w:r>
+          </w:p>
+        </w:tc>
+        <w:tc>
+          <w:tcPr>
+            <w:tcW w:type="dxa" w:w="850"/>
+            <w:tcMar>
+              <w:top w:w="60" w:type="dxa"/>
+              <w:left w:w="100" w:type="dxa"/>
+              <w:bottom w:w="60" w:type="dxa"/>
+              <w:right w:w="100" w:type="dxa"/>
+            </w:tcMar>
+          </w:tcPr>
+          <w:p>
+            <w:pPr>
+              <w:spacing w:after="0" w:line="240" w:lineRule="auto"/>
+              <w:jc w:val="right"/>
+            </w:pPr>
+            <w:r>
+              <w:rPr>
+                <w:sz w:val="18"/>
+              </w:rPr>
+              <w:t>$0.038</w:t>
+            </w:r>
+          </w:p>
+        </w:tc>
+        <w:tc>
+          <w:tcPr>
+            <w:tcW w:type="dxa" w:w="907"/>
+            <w:tcMar>
+              <w:top w:w="60" w:type="dxa"/>
+              <w:left w:w="100" w:type="dxa"/>
+              <w:bottom w:w="60" w:type="dxa"/>
+              <w:right w:w="100" w:type="dxa"/>
+            </w:tcMar>
+          </w:tcPr>
+          <w:p>
+            <w:pPr>
+              <w:spacing w:after="0" w:line="240" w:lineRule="auto"/>
+              <w:jc w:val="right"/>
+            </w:pPr>
+            <w:r>
+              <w:rPr>
+                <w:sz w:val="18"/>
+              </w:rPr>
+              <w:t>$0.000</w:t>
+            </w:r>
+          </w:p>
+        </w:tc>
+        <w:tc>
+          <w:tcPr>
+            <w:tcW w:type="dxa" w:w="850"/>
+            <w:tcMar>
+              <w:top w:w="60" w:type="dxa"/>
+              <w:left w:w="100" w:type="dxa"/>
+              <w:bottom w:w="60" w:type="dxa"/>
+              <w:right w:w="100" w:type="dxa"/>
+            </w:tcMar>
+          </w:tcPr>
+          <w:p>
+            <w:pPr>
+              <w:spacing w:after="0" w:line="240" w:lineRule="auto"/>
+              <w:jc w:val="right"/>
+            </w:pPr>
+            <w:r>
+              <w:rPr>
+                <w:sz w:val="18"/>
+              </w:rPr>
+              <w:t>$0.038</w:t>
+            </w:r>
+          </w:p>
+        </w:tc>
+        <w:tc>
+          <w:tcPr>
+            <w:tcW w:type="dxa" w:w="1020"/>
+            <w:tcMar>
+              <w:top w:w="60" w:type="dxa"/>
+              <w:left w:w="100" w:type="dxa"/>
+              <w:bottom w:w="60" w:type="dxa"/>
+              <w:right w:w="100" w:type="dxa"/>
+            </w:tcMar>
+          </w:tcPr>
+          <w:p>
+            <w:pPr>
+              <w:spacing w:after="0" w:line="240" w:lineRule="auto"/>
+              <w:jc w:val="right"/>
+            </w:pPr>
+            <w:r>
+              <w:rPr>
+                <w:sz w:val="18"/>
+              </w:rPr>
+              <w:t>3</w:t>
+            </w:r>
+          </w:p>
+        </w:tc>
+      </w:tr>
+      <w:tr>
+        <w:trPr>
+          <w:cantSplit/>
+        </w:trPr>
+        <w:tc>
+          <w:tcPr>
+            <w:tcW w:type="dxa" w:w="2381"/>
+            <w:tcMar>
+              <w:top w:w="60" w:type="dxa"/>
+              <w:left w:w="100" w:type="dxa"/>
+              <w:bottom w:w="60" w:type="dxa"/>
+              <w:right w:w="100" w:type="dxa"/>
+            </w:tcMar>
+          </w:tcPr>
+          <w:p>
+            <w:pPr>
+              <w:spacing w:after="0" w:line="240" w:lineRule="auto"/>
+            </w:pPr>
+            <w:r>
+              <w:rPr>
+                <w:sz w:val="18"/>
+              </w:rPr>
+              <w:t>B hybrid-static</w:t>
+            </w:r>
+          </w:p>
+        </w:tc>
+        <w:tc>
+          <w:tcPr>
+            <w:tcW w:type="dxa" w:w="1247"/>
+            <w:tcMar>
+              <w:top w:w="60" w:type="dxa"/>
+              <w:left w:w="100" w:type="dxa"/>
+              <w:bottom w:w="60" w:type="dxa"/>
+              <w:right w:w="100" w:type="dxa"/>
+            </w:tcMar>
+          </w:tcPr>
+          <w:p>
+            <w:pPr>
+              <w:spacing w:after="0" w:line="240" w:lineRule="auto"/>
+            </w:pPr>
+            <w:r>
+              <w:rPr>
+                <w:sz w:val="18"/>
+              </w:rPr>
+              <w:t>437 / 516</w:t>
+            </w:r>
+          </w:p>
+        </w:tc>
+        <w:tc>
+          <w:tcPr>
+            <w:tcW w:type="dxa" w:w="1361"/>
+            <w:tcMar>
+              <w:top w:w="60" w:type="dxa"/>
+              <w:left w:w="100" w:type="dxa"/>
+              <w:bottom w:w="60" w:type="dxa"/>
+              <w:right w:w="100" w:type="dxa"/>
+            </w:tcMar>
+          </w:tcPr>
+          <w:p>
+            <w:pPr>
+              <w:spacing w:after="0" w:line="240" w:lineRule="auto"/>
+            </w:pPr>
+            <w:r>
+              <w:rPr>
+                <w:sz w:val="18"/>
+              </w:rPr>
+              <w:t>459 / 760</w:t>
+            </w:r>
+          </w:p>
+        </w:tc>
+        <w:tc>
+          <w:tcPr>
+            <w:tcW w:type="dxa" w:w="1020"/>
+            <w:tcMar>
+              <w:top w:w="60" w:type="dxa"/>
+              <w:left w:w="100" w:type="dxa"/>
+              <w:bottom w:w="60" w:type="dxa"/>
+              <w:right w:w="100" w:type="dxa"/>
+            </w:tcMar>
+          </w:tcPr>
+          <w:p>
+            <w:pPr>
+              <w:spacing w:after="0" w:line="240" w:lineRule="auto"/>
+              <w:jc w:val="right"/>
+            </w:pPr>
+            <w:r>
+              <w:rPr>
+                <w:sz w:val="18"/>
+              </w:rPr>
+              <w:t>1.863</w:t>
+            </w:r>
+          </w:p>
+        </w:tc>
+        <w:tc>
+          <w:tcPr>
+            <w:tcW w:type="dxa" w:w="850"/>
+            <w:tcMar>
+              <w:top w:w="60" w:type="dxa"/>
+              <w:left w:w="100" w:type="dxa"/>
+              <w:bottom w:w="60" w:type="dxa"/>
+              <w:right w:w="100" w:type="dxa"/>
+            </w:tcMar>
+          </w:tcPr>
+          <w:p>
+            <w:pPr>
+              <w:spacing w:after="0" w:line="240" w:lineRule="auto"/>
+              <w:jc w:val="right"/>
+            </w:pPr>
+            <w:r>
+              <w:rPr>
+                <w:sz w:val="18"/>
+              </w:rPr>
+              <w:t>$0.083</w:t>
+            </w:r>
+          </w:p>
+        </w:tc>
+        <w:tc>
+          <w:tcPr>
+            <w:tcW w:type="dxa" w:w="907"/>
+            <w:tcMar>
+              <w:top w:w="60" w:type="dxa"/>
+              <w:left w:w="100" w:type="dxa"/>
+              <w:bottom w:w="60" w:type="dxa"/>
+              <w:right w:w="100" w:type="dxa"/>
+            </w:tcMar>
+          </w:tcPr>
+          <w:p>
+            <w:pPr>
+              <w:spacing w:after="0" w:line="240" w:lineRule="auto"/>
+              <w:jc w:val="right"/>
+            </w:pPr>
+            <w:r>
+              <w:rPr>
+                <w:sz w:val="18"/>
+              </w:rPr>
+              <w:t>$0.002</w:t>
+            </w:r>
+          </w:p>
+        </w:tc>
+        <w:tc>
+          <w:tcPr>
+            <w:tcW w:type="dxa" w:w="850"/>
+            <w:tcMar>
+              <w:top w:w="60" w:type="dxa"/>
+              <w:left w:w="100" w:type="dxa"/>
+              <w:bottom w:w="60" w:type="dxa"/>
+              <w:right w:w="100" w:type="dxa"/>
+            </w:tcMar>
+          </w:tcPr>
+          <w:p>
+            <w:pPr>
+              <w:spacing w:after="0" w:line="240" w:lineRule="auto"/>
+              <w:jc w:val="right"/>
+            </w:pPr>
+            <w:r>
+              <w:rPr>
+                <w:sz w:val="18"/>
+              </w:rPr>
+              <w:t>$0.085</w:t>
+            </w:r>
+          </w:p>
+        </w:tc>
+        <w:tc>
+          <w:tcPr>
+            <w:tcW w:type="dxa" w:w="1020"/>
+            <w:tcMar>
+              <w:top w:w="60" w:type="dxa"/>
+              <w:left w:w="100" w:type="dxa"/>
+              <w:bottom w:w="60" w:type="dxa"/>
+              <w:right w:w="100" w:type="dxa"/>
+            </w:tcMar>
+          </w:tcPr>
+          <w:p>
+            <w:pPr>
+              <w:spacing w:after="0" w:line="240" w:lineRule="auto"/>
+              <w:jc w:val="right"/>
+            </w:pPr>
+            <w:r>
+              <w:rPr>
+                <w:sz w:val="18"/>
+              </w:rPr>
+              <w:t>4</w:t>
+            </w:r>
+          </w:p>
+        </w:tc>
+      </w:tr>
+      <w:tr>
+        <w:trPr>
+          <w:cantSplit/>
+        </w:trPr>
+        <w:tc>
+          <w:tcPr>
+            <w:tcW w:type="dxa" w:w="2381"/>
+            <w:tcMar>
+              <w:top w:w="60" w:type="dxa"/>
+              <w:left w:w="100" w:type="dxa"/>
+              <w:bottom w:w="60" w:type="dxa"/>
+              <w:right w:w="100" w:type="dxa"/>
+            </w:tcMar>
+          </w:tcPr>
+          <w:p>
+            <w:pPr>
+              <w:spacing w:after="0" w:line="240" w:lineRule="auto"/>
+            </w:pPr>
+            <w:r>
+              <w:rPr>
+                <w:sz w:val="18"/>
+              </w:rPr>
+              <w:t>C hybrid-ML</w:t>
+            </w:r>
+          </w:p>
+        </w:tc>
+        <w:tc>
+          <w:tcPr>
+            <w:tcW w:type="dxa" w:w="1247"/>
+            <w:tcMar>
+              <w:top w:w="60" w:type="dxa"/>
+              <w:left w:w="100" w:type="dxa"/>
+              <w:bottom w:w="60" w:type="dxa"/>
+              <w:right w:w="100" w:type="dxa"/>
+            </w:tcMar>
+          </w:tcPr>
+          <w:p>
+            <w:pPr>
+              <w:spacing w:after="0" w:line="240" w:lineRule="auto"/>
+            </w:pPr>
+            <w:r>
+              <w:rPr>
+                <w:sz w:val="18"/>
+              </w:rPr>
+              <w:t>444 / 584</w:t>
+            </w:r>
+          </w:p>
+        </w:tc>
+        <w:tc>
+          <w:tcPr>
+            <w:tcW w:type="dxa" w:w="1361"/>
+            <w:tcMar>
+              <w:top w:w="60" w:type="dxa"/>
+              <w:left w:w="100" w:type="dxa"/>
+              <w:bottom w:w="60" w:type="dxa"/>
+              <w:right w:w="100" w:type="dxa"/>
+            </w:tcMar>
+          </w:tcPr>
+          <w:p>
+            <w:pPr>
+              <w:spacing w:after="0" w:line="240" w:lineRule="auto"/>
+            </w:pPr>
+            <w:r>
+              <w:rPr>
+                <w:sz w:val="18"/>
+              </w:rPr>
+              <w:t>480 / 752</w:t>
+            </w:r>
+          </w:p>
+        </w:tc>
+        <w:tc>
+          <w:tcPr>
+            <w:tcW w:type="dxa" w:w="1020"/>
+            <w:tcMar>
+              <w:top w:w="60" w:type="dxa"/>
+              <w:left w:w="100" w:type="dxa"/>
+              <w:bottom w:w="60" w:type="dxa"/>
+              <w:right w:w="100" w:type="dxa"/>
+            </w:tcMar>
+          </w:tcPr>
+          <w:p>
+            <w:pPr>
+              <w:spacing w:after="0" w:line="240" w:lineRule="auto"/>
+              <w:jc w:val="right"/>
+            </w:pPr>
+            <w:r>
+              <w:rPr>
+                <w:sz w:val="18"/>
+              </w:rPr>
+              <w:t>0.827</w:t>
+            </w:r>
+          </w:p>
+        </w:tc>
+        <w:tc>
+          <w:tcPr>
+            <w:tcW w:type="dxa" w:w="850"/>
+            <w:tcMar>
+              <w:top w:w="60" w:type="dxa"/>
+              <w:left w:w="100" w:type="dxa"/>
+              <w:bottom w:w="60" w:type="dxa"/>
+              <w:right w:w="100" w:type="dxa"/>
+            </w:tcMar>
+          </w:tcPr>
+          <w:p>
+            <w:pPr>
+              <w:spacing w:after="0" w:line="240" w:lineRule="auto"/>
+              <w:jc w:val="right"/>
+            </w:pPr>
+            <w:r>
+              <w:rPr>
+                <w:sz w:val="18"/>
+              </w:rPr>
+              <w:t>$0.037</w:t>
+            </w:r>
+          </w:p>
+        </w:tc>
+        <w:tc>
+          <w:tcPr>
+            <w:tcW w:type="dxa" w:w="907"/>
+            <w:tcMar>
+              <w:top w:w="60" w:type="dxa"/>
+              <w:left w:w="100" w:type="dxa"/>
+              <w:bottom w:w="60" w:type="dxa"/>
+              <w:right w:w="100" w:type="dxa"/>
+            </w:tcMar>
+          </w:tcPr>
+          <w:p>
+            <w:pPr>
+              <w:spacing w:after="0" w:line="240" w:lineRule="auto"/>
+              <w:jc w:val="right"/>
+            </w:pPr>
+            <w:r>
+              <w:rPr>
+                <w:sz w:val="18"/>
+              </w:rPr>
+              <w:t>$0.002</w:t>
+            </w:r>
+          </w:p>
+        </w:tc>
+        <w:tc>
+          <w:tcPr>
+            <w:tcW w:type="dxa" w:w="850"/>
+            <w:tcMar>
+              <w:top w:w="60" w:type="dxa"/>
+              <w:left w:w="100" w:type="dxa"/>
+              <w:bottom w:w="60" w:type="dxa"/>
+              <w:right w:w="100" w:type="dxa"/>
+            </w:tcMar>
+          </w:tcPr>
+          <w:p>
+            <w:pPr>
+              <w:spacing w:after="0" w:line="240" w:lineRule="auto"/>
+              <w:jc w:val="right"/>
+            </w:pPr>
+            <w:r>
+              <w:rPr>
+                <w:sz w:val="18"/>
+              </w:rPr>
+              <w:t>$0.039</w:t>
+            </w:r>
+          </w:p>
+        </w:tc>
+        <w:tc>
+          <w:tcPr>
+            <w:tcW w:type="dxa" w:w="1020"/>
+            <w:tcMar>
+              <w:top w:w="60" w:type="dxa"/>
+              <w:left w:w="100" w:type="dxa"/>
+              <w:bottom w:w="60" w:type="dxa"/>
+              <w:right w:w="100" w:type="dxa"/>
+            </w:tcMar>
+          </w:tcPr>
+          <w:p>
+            <w:pPr>
+              <w:spacing w:after="0" w:line="240" w:lineRule="auto"/>
+              <w:jc w:val="right"/>
+            </w:pPr>
+            <w:r>
+              <w:rPr>
+                <w:sz w:val="18"/>
+              </w:rPr>
+              <w:t>3</w:t>
+            </w:r>
+          </w:p>
+        </w:tc>
+      </w:tr>
+      <w:tr>
+        <w:trPr>
+          <w:cantSplit/>
+        </w:trPr>
+        <w:tc>
+          <w:tcPr>
+            <w:tcW w:type="dxa" w:w="2381"/>
+            <w:tcMar>
+              <w:top w:w="60" w:type="dxa"/>
+              <w:left w:w="100" w:type="dxa"/>
+              <w:bottom w:w="60" w:type="dxa"/>
+              <w:right w:w="100" w:type="dxa"/>
+            </w:tcMar>
+          </w:tcPr>
+          <w:p>
+            <w:pPr>
+              <w:spacing w:after="0" w:line="240" w:lineRule="auto"/>
+            </w:pPr>
+            <w:r>
+              <w:rPr>
+                <w:sz w:val="18"/>
+              </w:rPr>
+              <w:t>D hybrid-ML + x4 spike</w:t>
+            </w:r>
+          </w:p>
+        </w:tc>
+        <w:tc>
+          <w:tcPr>
+            <w:tcW w:type="dxa" w:w="1247"/>
+            <w:tcMar>
+              <w:top w:w="60" w:type="dxa"/>
+              <w:left w:w="100" w:type="dxa"/>
+              <w:bottom w:w="60" w:type="dxa"/>
+              <w:right w:w="100" w:type="dxa"/>
+            </w:tcMar>
+          </w:tcPr>
+          <w:p>
+            <w:pPr>
+              <w:spacing w:after="0" w:line="240" w:lineRule="auto"/>
+            </w:pPr>
+            <w:r>
+              <w:rPr>
+                <w:sz w:val="18"/>
+              </w:rPr>
+              <w:t>454 / 2784</w:t>
+            </w:r>
+          </w:p>
+        </w:tc>
+        <w:tc>
+          <w:tcPr>
+            <w:tcW w:type="dxa" w:w="1361"/>
+            <w:tcMar>
+              <w:top w:w="60" w:type="dxa"/>
+              <w:left w:w="100" w:type="dxa"/>
+              <w:bottom w:w="60" w:type="dxa"/>
+              <w:right w:w="100" w:type="dxa"/>
+            </w:tcMar>
+          </w:tcPr>
+          <w:p>
+            <w:pPr>
+              <w:spacing w:after="0" w:line="240" w:lineRule="auto"/>
+            </w:pPr>
+            <w:r>
+              <w:rPr>
+                <w:sz w:val="18"/>
+              </w:rPr>
+              <w:t>454 / 505</w:t>
+            </w:r>
+          </w:p>
+        </w:tc>
+        <w:tc>
+          <w:tcPr>
+            <w:tcW w:type="dxa" w:w="1020"/>
+            <w:tcMar>
+              <w:top w:w="60" w:type="dxa"/>
+              <w:left w:w="100" w:type="dxa"/>
+              <w:bottom w:w="60" w:type="dxa"/>
+              <w:right w:w="100" w:type="dxa"/>
+            </w:tcMar>
+          </w:tcPr>
+          <w:p>
+            <w:pPr>
+              <w:spacing w:after="0" w:line="240" w:lineRule="auto"/>
+              <w:jc w:val="right"/>
+            </w:pPr>
+            <w:r>
+              <w:rPr>
+                <w:sz w:val="18"/>
+              </w:rPr>
+              <w:t>1.131</w:t>
+            </w:r>
+          </w:p>
+        </w:tc>
+        <w:tc>
+          <w:tcPr>
+            <w:tcW w:type="dxa" w:w="850"/>
+            <w:tcMar>
+              <w:top w:w="60" w:type="dxa"/>
+              <w:left w:w="100" w:type="dxa"/>
+              <w:bottom w:w="60" w:type="dxa"/>
+              <w:right w:w="100" w:type="dxa"/>
+            </w:tcMar>
+          </w:tcPr>
+          <w:p>
+            <w:pPr>
+              <w:spacing w:after="0" w:line="240" w:lineRule="auto"/>
+              <w:jc w:val="right"/>
+            </w:pPr>
+            <w:r>
+              <w:rPr>
+                <w:sz w:val="18"/>
+              </w:rPr>
+              <w:t>$0.051</w:t>
+            </w:r>
+          </w:p>
+        </w:tc>
+        <w:tc>
+          <w:tcPr>
+            <w:tcW w:type="dxa" w:w="907"/>
+            <w:tcMar>
+              <w:top w:w="60" w:type="dxa"/>
+              <w:left w:w="100" w:type="dxa"/>
+              <w:bottom w:w="60" w:type="dxa"/>
+              <w:right w:w="100" w:type="dxa"/>
+            </w:tcMar>
+          </w:tcPr>
+          <w:p>
+            <w:pPr>
+              <w:spacing w:after="0" w:line="240" w:lineRule="auto"/>
+              <w:jc w:val="right"/>
+            </w:pPr>
+            <w:r>
+              <w:rPr>
+                <w:sz w:val="18"/>
+              </w:rPr>
+              <w:t>$0.073</w:t>
+            </w:r>
+          </w:p>
+        </w:tc>
+        <w:tc>
+          <w:tcPr>
+            <w:tcW w:type="dxa" w:w="850"/>
+            <w:tcMar>
+              <w:top w:w="60" w:type="dxa"/>
+              <w:left w:w="100" w:type="dxa"/>
+              <w:bottom w:w="60" w:type="dxa"/>
+              <w:right w:w="100" w:type="dxa"/>
+            </w:tcMar>
+          </w:tcPr>
+          <w:p>
+            <w:pPr>
+              <w:spacing w:after="0" w:line="240" w:lineRule="auto"/>
+              <w:jc w:val="right"/>
+            </w:pPr>
+            <w:r>
+              <w:rPr>
+                <w:sz w:val="18"/>
+              </w:rPr>
+              <w:t>$0.124</w:t>
+            </w:r>
+          </w:p>
+        </w:tc>
+        <w:tc>
+          <w:tcPr>
+            <w:tcW w:type="dxa" w:w="1020"/>
+            <w:tcMar>
+              <w:top w:w="60" w:type="dxa"/>
+              <w:left w:w="100" w:type="dxa"/>
+              <w:bottom w:w="60" w:type="dxa"/>
+              <w:right w:w="100" w:type="dxa"/>
+            </w:tcMar>
+          </w:tcPr>
+          <w:p>
+            <w:pPr>
+              <w:spacing w:after="0" w:line="240" w:lineRule="auto"/>
+              <w:jc w:val="right"/>
+            </w:pPr>
+            <w:r>
+              <w:rPr>
+                <w:sz w:val="18"/>
+              </w:rPr>
+              <w:t>5</w:t>
+            </w:r>
+          </w:p>
+        </w:tc>
+      </w:tr>
+    </w:tbl>
+    <w:p>
+      <w:pPr>
+        <w:spacing w:after="120"/>
+      </w:pPr>
+    </w:p>
+    <w:p>
+      <w:pPr>
+        <w:spacing w:after="140" w:before="0" w:line="340" w:lineRule="auto"/>
+        <w:jc w:val="both"/>
+      </w:pPr>
+      <w:r>
+        <w:rPr/>
+        <w:t>Costs are computed from the instance-time recorded by the controller and from the CloudWatch Lambda duration and invocation counts at the Mumbai prices of Section 5.1; the load balancer, public addresses and CloudWatch are not included, because they are the same for every arm. Energy uses the estimate methodology of Section 8.6 with the measured mean CPU utilisation.</w:t>
+      </w:r>
+    </w:p>
+    <w:p>
+      <w:pPr>
+        <w:keepNext/>
+        <w:spacing w:after="80"/>
+        <w:jc w:val="center"/>
+      </w:pPr>
+      <w:r>
+        <w:drawing>
+          <wp:inline xmlns:a="http://schemas.openxmlformats.org/drawingml/2006/main" xmlns:pic="http://schemas.openxmlformats.org/drawingml/2006/picture">
+            <wp:extent cx="5580000" cy="3549059"/>
+            <wp:docPr id="7" name="Picture 7"/>
+            <wp:cNvGraphicFramePr>
+              <a:graphicFrameLocks noChangeAspect="1"/>
+            </wp:cNvGraphicFramePr>
+            <a:graphic>
+              <a:graphicData uri="http://schemas.openxmlformats.org/drawingml/2006/picture">
+                <pic:pic>
+                  <pic:nvPicPr>
+                    <pic:cNvPr id="0" name="live_timelines.png"/>
+                    <pic:cNvPicPr/>
+                  </pic:nvPicPr>
+                  <pic:blipFill>
+                    <a:blip r:embed="rId28"/>
+                    <a:stretch>
+                      <a:fillRect/>
+                    </a:stretch>
+                  </pic:blipFill>
+                  <pic:spPr>
+                    <a:xfrm>
+                      <a:off x="0" y="0"/>
+                      <a:ext cx="5580000" cy="3549059"/>
+                    </a:xfrm>
+                    <a:prstGeom prst="rect"/>
+                  </pic:spPr>
+                </pic:pic>
+              </a:graphicData>
+            </a:graphic>
+          </wp:inline>
+        </w:drawing>
+      </w:r>
+    </w:p>
+    <w:p>
+      <w:pPr>
+        <w:spacing w:after="200" w:before="0" w:line="276" w:lineRule="auto"/>
+        <w:jc w:val="center"/>
+      </w:pPr>
+      <w:r>
+        <w:rPr>
+          <w:sz w:val="22"/>
+        </w:rPr>
+        <w:t>Figure 7: Live timelines: request rate, base capacity and EC2 share for each arm</w:t>
+      </w:r>
+    </w:p>
+    <w:p>
+      <w:pPr>
+        <w:keepNext/>
+        <w:spacing w:after="80"/>
+        <w:jc w:val="center"/>
+      </w:pPr>
+      <w:r>
+        <w:drawing>
+          <wp:inline xmlns:a="http://schemas.openxmlformats.org/drawingml/2006/main" xmlns:pic="http://schemas.openxmlformats.org/drawingml/2006/picture">
+            <wp:extent cx="5400000" cy="2032385"/>
+            <wp:docPr id="8" name="Picture 8"/>
+            <wp:cNvGraphicFramePr>
+              <a:graphicFrameLocks noChangeAspect="1"/>
+            </wp:cNvGraphicFramePr>
+            <a:graphic>
+              <a:graphicData uri="http://schemas.openxmlformats.org/drawingml/2006/picture">
+                <pic:pic>
+                  <pic:nvPicPr>
+                    <pic:cNvPr id="0" name="live_latency_cost.png"/>
+                    <pic:cNvPicPr/>
+                  </pic:nvPicPr>
+                  <pic:blipFill>
+                    <a:blip r:embed="rId29"/>
+                    <a:stretch>
+                      <a:fillRect/>
+                    </a:stretch>
+                  </pic:blipFill>
+                  <pic:spPr>
+                    <a:xfrm>
+                      <a:off x="0" y="0"/>
+                      <a:ext cx="5400000" cy="2032385"/>
+                    </a:xfrm>
+                    <a:prstGeom prst="rect"/>
+                  </pic:spPr>
+                </pic:pic>
+              </a:graphicData>
+            </a:graphic>
+          </wp:inline>
+        </w:drawing>
+      </w:r>
+    </w:p>
+    <w:p>
+      <w:pPr>
+        <w:spacing w:after="200" w:before="0" w:line="276" w:lineRule="auto"/>
+        <w:jc w:val="center"/>
+      </w:pPr>
+      <w:r>
+        <w:rPr>
+          <w:sz w:val="22"/>
+        </w:rPr>
+        <w:t>Figure 8: Live p95 latency per window and cumulative cost for each arm</w:t>
+      </w:r>
+    </w:p>
+    <w:p>
+      <w:pPr>
+        <w:keepNext/>
+        <w:spacing w:after="80" w:before="120" w:line="276" w:lineRule="auto"/>
+        <w:jc w:val="center"/>
+      </w:pPr>
+      <w:r>
+        <w:rPr>
+          <w:sz w:val="22"/>
+        </w:rPr>
+        <w:t>Table 15: Reconciliation: live arms against a simulator replay of the same arm</w:t>
+      </w:r>
+    </w:p>
+    <w:tbl>
+      <w:tblPr>
+        <w:tblW w:type="auto" w:w="0"/>
+        <w:tblLayout w:type="fixed"/>
+        <w:tblLook w:firstColumn="1" w:firstRow="1" w:lastColumn="0" w:lastRow="0" w:noHBand="0" w:noVBand="1" w:val="04A0"/>
+        <w:tblBorders>
+          <w:top w:val="single" w:sz="4" w:space="0" w:color="808080"/>
+          <w:left w:val="single" w:sz="4" w:space="0" w:color="808080"/>
+          <w:bottom w:val="single" w:sz="4" w:space="0" w:color="808080"/>
+          <w:right w:val="single" w:sz="4" w:space="0" w:color="808080"/>
+          <w:insideH w:val="single" w:sz="4" w:space="0" w:color="808080"/>
+          <w:insideV w:val="single" w:sz="4" w:space="0" w:color="808080"/>
+        </w:tblBorders>
+      </w:tblPr>
+      <w:tblGrid>
+        <w:gridCol w:w="1289"/>
+        <w:gridCol w:w="1289"/>
+        <w:gridCol w:w="1289"/>
+        <w:gridCol w:w="1289"/>
+        <w:gridCol w:w="1289"/>
+        <w:gridCol w:w="1289"/>
+        <w:gridCol w:w="1289"/>
+      </w:tblGrid>
+      <w:tr>
+        <w:trPr>
+          <w:cantSplit/>
+          <w:tblHeader/>
+        </w:trPr>
+        <w:tc>
+          <w:tcPr>
+            <w:tcW w:type="dxa" w:w="2608"/>
+            <w:tcMar>
+              <w:top w:w="60" w:type="dxa"/>
+              <w:left w:w="100" w:type="dxa"/>
+              <w:bottom w:w="60" w:type="dxa"/>
+              <w:right w:w="100" w:type="dxa"/>
+            </w:tcMar>
+            <w:shd w:val="clear" w:color="auto" w:fill="D9D9D9"/>
+          </w:tcPr>
+          <w:p>
+            <w:pPr>
+              <w:spacing w:after="0" w:line="240" w:lineRule="auto"/>
+            </w:pPr>
+            <w:r>
+              <w:rPr>
+                <w:b/>
+                <w:sz w:val="18"/>
+              </w:rPr>
+              <w:t>Arm</w:t>
+            </w:r>
+          </w:p>
+        </w:tc>
+        <w:tc>
+          <w:tcPr>
+            <w:tcW w:type="dxa" w:w="1247"/>
+            <w:tcMar>
+              <w:top w:w="60" w:type="dxa"/>
+              <w:left w:w="100" w:type="dxa"/>
+              <w:bottom w:w="60" w:type="dxa"/>
+              <w:right w:w="100" w:type="dxa"/>
+            </w:tcMar>
+            <w:shd w:val="clear" w:color="auto" w:fill="D9D9D9"/>
+          </w:tcPr>
+          <w:p>
+            <w:pPr>
+              <w:spacing w:after="0" w:line="240" w:lineRule="auto"/>
+            </w:pPr>
+            <w:r>
+              <w:rPr>
+                <w:b/>
+                <w:sz w:val="18"/>
+              </w:rPr>
+              <w:t>Lambda share live</w:t>
+            </w:r>
+          </w:p>
+        </w:tc>
+        <w:tc>
+          <w:tcPr>
+            <w:tcW w:type="dxa" w:w="1361"/>
+            <w:tcMar>
+              <w:top w:w="60" w:type="dxa"/>
+              <w:left w:w="100" w:type="dxa"/>
+              <w:bottom w:w="60" w:type="dxa"/>
+              <w:right w:w="100" w:type="dxa"/>
+            </w:tcMar>
+            <w:shd w:val="clear" w:color="auto" w:fill="D9D9D9"/>
+          </w:tcPr>
+          <w:p>
+            <w:pPr>
+              <w:spacing w:after="0" w:line="240" w:lineRule="auto"/>
+            </w:pPr>
+            <w:r>
+              <w:rPr>
+                <w:b/>
+                <w:sz w:val="18"/>
+              </w:rPr>
+              <w:t>Lambda share replay</w:t>
+            </w:r>
+          </w:p>
+        </w:tc>
+        <w:tc>
+          <w:tcPr>
+            <w:tcW w:type="dxa" w:w="1020"/>
+            <w:tcMar>
+              <w:top w:w="60" w:type="dxa"/>
+              <w:left w:w="100" w:type="dxa"/>
+              <w:bottom w:w="60" w:type="dxa"/>
+              <w:right w:w="100" w:type="dxa"/>
+            </w:tcMar>
+            <w:shd w:val="clear" w:color="auto" w:fill="D9D9D9"/>
+          </w:tcPr>
+          <w:p>
+            <w:pPr>
+              <w:spacing w:after="0" w:line="240" w:lineRule="auto"/>
+            </w:pPr>
+            <w:r>
+              <w:rPr>
+                <w:b/>
+                <w:sz w:val="18"/>
+              </w:rPr>
+              <w:t>Gap (points)</w:t>
+            </w:r>
+          </w:p>
+        </w:tc>
+        <w:tc>
+          <w:tcPr>
+            <w:tcW w:type="dxa" w:w="907"/>
+            <w:tcMar>
+              <w:top w:w="60" w:type="dxa"/>
+              <w:left w:w="100" w:type="dxa"/>
+              <w:bottom w:w="60" w:type="dxa"/>
+              <w:right w:w="100" w:type="dxa"/>
+            </w:tcMar>
+            <w:shd w:val="clear" w:color="auto" w:fill="D9D9D9"/>
+          </w:tcPr>
+          <w:p>
+            <w:pPr>
+              <w:spacing w:after="0" w:line="240" w:lineRule="auto"/>
+            </w:pPr>
+            <w:r>
+              <w:rPr>
+                <w:b/>
+                <w:sz w:val="18"/>
+              </w:rPr>
+              <w:t>Cost live</w:t>
+            </w:r>
+          </w:p>
+        </w:tc>
+        <w:tc>
+          <w:tcPr>
+            <w:tcW w:type="dxa" w:w="1020"/>
+            <w:tcMar>
+              <w:top w:w="60" w:type="dxa"/>
+              <w:left w:w="100" w:type="dxa"/>
+              <w:bottom w:w="60" w:type="dxa"/>
+              <w:right w:w="100" w:type="dxa"/>
+            </w:tcMar>
+            <w:shd w:val="clear" w:color="auto" w:fill="D9D9D9"/>
+          </w:tcPr>
+          <w:p>
+            <w:pPr>
+              <w:spacing w:after="0" w:line="240" w:lineRule="auto"/>
+            </w:pPr>
+            <w:r>
+              <w:rPr>
+                <w:b/>
+                <w:sz w:val="18"/>
+              </w:rPr>
+              <w:t>Cost replay</w:t>
+            </w:r>
+          </w:p>
+        </w:tc>
+        <w:tc>
+          <w:tcPr>
+            <w:tcW w:type="dxa" w:w="907"/>
+            <w:tcMar>
+              <w:top w:w="60" w:type="dxa"/>
+              <w:left w:w="100" w:type="dxa"/>
+              <w:bottom w:w="60" w:type="dxa"/>
+              <w:right w:w="100" w:type="dxa"/>
+            </w:tcMar>
+            <w:shd w:val="clear" w:color="auto" w:fill="D9D9D9"/>
+          </w:tcPr>
+          <w:p>
+            <w:pPr>
+              <w:spacing w:after="0" w:line="240" w:lineRule="auto"/>
+            </w:pPr>
+            <w:r>
+              <w:rPr>
+                <w:b/>
+                <w:sz w:val="18"/>
+              </w:rPr>
+              <w:t>Cost gap</w:t>
+            </w:r>
+          </w:p>
+        </w:tc>
+      </w:tr>
+      <w:tr>
+        <w:trPr>
+          <w:cantSplit/>
+        </w:trPr>
+        <w:tc>
+          <w:tcPr>
+            <w:tcW w:type="dxa" w:w="2608"/>
+            <w:tcMar>
+              <w:top w:w="60" w:type="dxa"/>
+              <w:left w:w="100" w:type="dxa"/>
+              <w:bottom w:w="60" w:type="dxa"/>
+              <w:right w:w="100" w:type="dxa"/>
+            </w:tcMar>
+          </w:tcPr>
+          <w:p>
+            <w:pPr>
+              <w:spacing w:after="0" w:line="240" w:lineRule="auto"/>
+            </w:pPr>
+            <w:r>
+              <w:rPr>
+                <w:sz w:val="18"/>
+              </w:rPr>
+              <w:t>A reactive (ASG target tracking)</w:t>
+            </w:r>
+          </w:p>
+        </w:tc>
+        <w:tc>
+          <w:tcPr>
+            <w:tcW w:type="dxa" w:w="1247"/>
+            <w:tcMar>
+              <w:top w:w="60" w:type="dxa"/>
+              <w:left w:w="100" w:type="dxa"/>
+              <w:bottom w:w="60" w:type="dxa"/>
+              <w:right w:w="100" w:type="dxa"/>
+            </w:tcMar>
+          </w:tcPr>
+          <w:p>
+            <w:pPr>
+              <w:spacing w:after="0" w:line="240" w:lineRule="auto"/>
+              <w:jc w:val="right"/>
+            </w:pPr>
+            <w:r>
+              <w:rPr>
+                <w:sz w:val="18"/>
+              </w:rPr>
+              <w:t>0.2%</w:t>
+            </w:r>
+          </w:p>
+        </w:tc>
+        <w:tc>
+          <w:tcPr>
+            <w:tcW w:type="dxa" w:w="1361"/>
+            <w:tcMar>
+              <w:top w:w="60" w:type="dxa"/>
+              <w:left w:w="100" w:type="dxa"/>
+              <w:bottom w:w="60" w:type="dxa"/>
+              <w:right w:w="100" w:type="dxa"/>
+            </w:tcMar>
+          </w:tcPr>
+          <w:p>
+            <w:pPr>
+              <w:spacing w:after="0" w:line="240" w:lineRule="auto"/>
+              <w:jc w:val="right"/>
+            </w:pPr>
+            <w:r>
+              <w:rPr>
+                <w:sz w:val="18"/>
+              </w:rPr>
+              <w:t>0.0%</w:t>
+            </w:r>
+          </w:p>
+        </w:tc>
+        <w:tc>
+          <w:tcPr>
+            <w:tcW w:type="dxa" w:w="1020"/>
+            <w:tcMar>
+              <w:top w:w="60" w:type="dxa"/>
+              <w:left w:w="100" w:type="dxa"/>
+              <w:bottom w:w="60" w:type="dxa"/>
+              <w:right w:w="100" w:type="dxa"/>
+            </w:tcMar>
+          </w:tcPr>
+          <w:p>
+            <w:pPr>
+              <w:spacing w:after="0" w:line="240" w:lineRule="auto"/>
+            </w:pPr>
+            <w:r>
+              <w:rPr>
+                <w:sz w:val="18"/>
+              </w:rPr>
+              <w:t>+0.2</w:t>
+            </w:r>
+          </w:p>
+        </w:tc>
+        <w:tc>
+          <w:tcPr>
+            <w:tcW w:type="dxa" w:w="907"/>
+            <w:tcMar>
+              <w:top w:w="60" w:type="dxa"/>
+              <w:left w:w="100" w:type="dxa"/>
+              <w:bottom w:w="60" w:type="dxa"/>
+              <w:right w:w="100" w:type="dxa"/>
+            </w:tcMar>
+          </w:tcPr>
+          <w:p>
+            <w:pPr>
+              <w:spacing w:after="0" w:line="240" w:lineRule="auto"/>
+              <w:jc w:val="right"/>
+            </w:pPr>
+            <w:r>
+              <w:rPr>
+                <w:sz w:val="18"/>
+              </w:rPr>
+              <w:t>$0.038</w:t>
+            </w:r>
+          </w:p>
+        </w:tc>
+        <w:tc>
+          <w:tcPr>
+            <w:tcW w:type="dxa" w:w="1020"/>
+            <w:tcMar>
+              <w:top w:w="60" w:type="dxa"/>
+              <w:left w:w="100" w:type="dxa"/>
+              <w:bottom w:w="60" w:type="dxa"/>
+              <w:right w:w="100" w:type="dxa"/>
+            </w:tcMar>
+          </w:tcPr>
+          <w:p>
+            <w:pPr>
+              <w:spacing w:after="0" w:line="240" w:lineRule="auto"/>
+              <w:jc w:val="right"/>
+            </w:pPr>
+            <w:r>
+              <w:rPr>
+                <w:sz w:val="18"/>
+              </w:rPr>
+              <w:t>$0.038</w:t>
+            </w:r>
+          </w:p>
+        </w:tc>
+        <w:tc>
+          <w:tcPr>
+            <w:tcW w:type="dxa" w:w="907"/>
+            <w:tcMar>
+              <w:top w:w="60" w:type="dxa"/>
+              <w:left w:w="100" w:type="dxa"/>
+              <w:bottom w:w="60" w:type="dxa"/>
+              <w:right w:w="100" w:type="dxa"/>
+            </w:tcMar>
+          </w:tcPr>
+          <w:p>
+            <w:pPr>
+              <w:spacing w:after="0" w:line="240" w:lineRule="auto"/>
+            </w:pPr>
+            <w:r>
+              <w:rPr>
+                <w:sz w:val="18"/>
+              </w:rPr>
+              <w:t>+1%</w:t>
+            </w:r>
+          </w:p>
+        </w:tc>
+      </w:tr>
+      <w:tr>
+        <w:trPr>
+          <w:cantSplit/>
+        </w:trPr>
+        <w:tc>
+          <w:tcPr>
+            <w:tcW w:type="dxa" w:w="2608"/>
+            <w:tcMar>
+              <w:top w:w="60" w:type="dxa"/>
+              <w:left w:w="100" w:type="dxa"/>
+              <w:bottom w:w="60" w:type="dxa"/>
+              <w:right w:w="100" w:type="dxa"/>
+            </w:tcMar>
+          </w:tcPr>
+          <w:p>
+            <w:pPr>
+              <w:spacing w:after="0" w:line="240" w:lineRule="auto"/>
+            </w:pPr>
+            <w:r>
+              <w:rPr>
+                <w:sz w:val="18"/>
+              </w:rPr>
+              <w:t>B hybrid-static</w:t>
+            </w:r>
+          </w:p>
+        </w:tc>
+        <w:tc>
+          <w:tcPr>
+            <w:tcW w:type="dxa" w:w="1247"/>
+            <w:tcMar>
+              <w:top w:w="60" w:type="dxa"/>
+              <w:left w:w="100" w:type="dxa"/>
+              <w:bottom w:w="60" w:type="dxa"/>
+              <w:right w:w="100" w:type="dxa"/>
+            </w:tcMar>
+          </w:tcPr>
+          <w:p>
+            <w:pPr>
+              <w:spacing w:after="0" w:line="240" w:lineRule="auto"/>
+              <w:jc w:val="right"/>
+            </w:pPr>
+            <w:r>
+              <w:rPr>
+                <w:sz w:val="18"/>
+              </w:rPr>
+              <w:t>0.7%</w:t>
+            </w:r>
+          </w:p>
+        </w:tc>
+        <w:tc>
+          <w:tcPr>
+            <w:tcW w:type="dxa" w:w="1361"/>
+            <w:tcMar>
+              <w:top w:w="60" w:type="dxa"/>
+              <w:left w:w="100" w:type="dxa"/>
+              <w:bottom w:w="60" w:type="dxa"/>
+              <w:right w:w="100" w:type="dxa"/>
+            </w:tcMar>
+          </w:tcPr>
+          <w:p>
+            <w:pPr>
+              <w:spacing w:after="0" w:line="240" w:lineRule="auto"/>
+              <w:jc w:val="right"/>
+            </w:pPr>
+            <w:r>
+              <w:rPr>
+                <w:sz w:val="18"/>
+              </w:rPr>
+              <w:t>0.0%</w:t>
+            </w:r>
+          </w:p>
+        </w:tc>
+        <w:tc>
+          <w:tcPr>
+            <w:tcW w:type="dxa" w:w="1020"/>
+            <w:tcMar>
+              <w:top w:w="60" w:type="dxa"/>
+              <w:left w:w="100" w:type="dxa"/>
+              <w:bottom w:w="60" w:type="dxa"/>
+              <w:right w:w="100" w:type="dxa"/>
+            </w:tcMar>
+          </w:tcPr>
+          <w:p>
+            <w:pPr>
+              <w:spacing w:after="0" w:line="240" w:lineRule="auto"/>
+            </w:pPr>
+            <w:r>
+              <w:rPr>
+                <w:sz w:val="18"/>
+              </w:rPr>
+              <w:t>+0.7</w:t>
+            </w:r>
+          </w:p>
+        </w:tc>
+        <w:tc>
+          <w:tcPr>
+            <w:tcW w:type="dxa" w:w="907"/>
+            <w:tcMar>
+              <w:top w:w="60" w:type="dxa"/>
+              <w:left w:w="100" w:type="dxa"/>
+              <w:bottom w:w="60" w:type="dxa"/>
+              <w:right w:w="100" w:type="dxa"/>
+            </w:tcMar>
+          </w:tcPr>
+          <w:p>
+            <w:pPr>
+              <w:spacing w:after="0" w:line="240" w:lineRule="auto"/>
+              <w:jc w:val="right"/>
+            </w:pPr>
+            <w:r>
+              <w:rPr>
+                <w:sz w:val="18"/>
+              </w:rPr>
+              <w:t>$0.085</w:t>
+            </w:r>
+          </w:p>
+        </w:tc>
+        <w:tc>
+          <w:tcPr>
+            <w:tcW w:type="dxa" w:w="1020"/>
+            <w:tcMar>
+              <w:top w:w="60" w:type="dxa"/>
+              <w:left w:w="100" w:type="dxa"/>
+              <w:bottom w:w="60" w:type="dxa"/>
+              <w:right w:w="100" w:type="dxa"/>
+            </w:tcMar>
+          </w:tcPr>
+          <w:p>
+            <w:pPr>
+              <w:spacing w:after="0" w:line="240" w:lineRule="auto"/>
+              <w:jc w:val="right"/>
+            </w:pPr>
+            <w:r>
+              <w:rPr>
+                <w:sz w:val="18"/>
+              </w:rPr>
+              <w:t>$0.084</w:t>
+            </w:r>
+          </w:p>
+        </w:tc>
+        <w:tc>
+          <w:tcPr>
+            <w:tcW w:type="dxa" w:w="907"/>
+            <w:tcMar>
+              <w:top w:w="60" w:type="dxa"/>
+              <w:left w:w="100" w:type="dxa"/>
+              <w:bottom w:w="60" w:type="dxa"/>
+              <w:right w:w="100" w:type="dxa"/>
+            </w:tcMar>
+          </w:tcPr>
+          <w:p>
+            <w:pPr>
+              <w:spacing w:after="0" w:line="240" w:lineRule="auto"/>
+            </w:pPr>
+            <w:r>
+              <w:rPr>
+                <w:sz w:val="18"/>
+              </w:rPr>
+              <w:t>+1%</w:t>
+            </w:r>
+          </w:p>
+        </w:tc>
+      </w:tr>
+      <w:tr>
+        <w:trPr>
+          <w:cantSplit/>
+        </w:trPr>
+        <w:tc>
+          <w:tcPr>
+            <w:tcW w:type="dxa" w:w="2608"/>
+            <w:tcMar>
+              <w:top w:w="60" w:type="dxa"/>
+              <w:left w:w="100" w:type="dxa"/>
+              <w:bottom w:w="60" w:type="dxa"/>
+              <w:right w:w="100" w:type="dxa"/>
+            </w:tcMar>
+          </w:tcPr>
+          <w:p>
+            <w:pPr>
+              <w:spacing w:after="0" w:line="240" w:lineRule="auto"/>
+            </w:pPr>
+            <w:r>
+              <w:rPr>
+                <w:sz w:val="18"/>
+              </w:rPr>
+              <w:t>C hybrid-ML</w:t>
+            </w:r>
+          </w:p>
+        </w:tc>
+        <w:tc>
+          <w:tcPr>
+            <w:tcW w:type="dxa" w:w="1247"/>
+            <w:tcMar>
+              <w:top w:w="60" w:type="dxa"/>
+              <w:left w:w="100" w:type="dxa"/>
+              <w:bottom w:w="60" w:type="dxa"/>
+              <w:right w:w="100" w:type="dxa"/>
+            </w:tcMar>
+          </w:tcPr>
+          <w:p>
+            <w:pPr>
+              <w:spacing w:after="0" w:line="240" w:lineRule="auto"/>
+              <w:jc w:val="right"/>
+            </w:pPr>
+            <w:r>
+              <w:rPr>
+                <w:sz w:val="18"/>
+              </w:rPr>
+              <w:t>0.5%</w:t>
+            </w:r>
+          </w:p>
+        </w:tc>
+        <w:tc>
+          <w:tcPr>
+            <w:tcW w:type="dxa" w:w="1361"/>
+            <w:tcMar>
+              <w:top w:w="60" w:type="dxa"/>
+              <w:left w:w="100" w:type="dxa"/>
+              <w:bottom w:w="60" w:type="dxa"/>
+              <w:right w:w="100" w:type="dxa"/>
+            </w:tcMar>
+          </w:tcPr>
+          <w:p>
+            <w:pPr>
+              <w:spacing w:after="0" w:line="240" w:lineRule="auto"/>
+              <w:jc w:val="right"/>
+            </w:pPr>
+            <w:r>
+              <w:rPr>
+                <w:sz w:val="18"/>
+              </w:rPr>
+              <w:t>0.2%</w:t>
+            </w:r>
+          </w:p>
+        </w:tc>
+        <w:tc>
+          <w:tcPr>
+            <w:tcW w:type="dxa" w:w="1020"/>
+            <w:tcMar>
+              <w:top w:w="60" w:type="dxa"/>
+              <w:left w:w="100" w:type="dxa"/>
+              <w:bottom w:w="60" w:type="dxa"/>
+              <w:right w:w="100" w:type="dxa"/>
+            </w:tcMar>
+          </w:tcPr>
+          <w:p>
+            <w:pPr>
+              <w:spacing w:after="0" w:line="240" w:lineRule="auto"/>
+            </w:pPr>
+            <w:r>
+              <w:rPr>
+                <w:sz w:val="18"/>
+              </w:rPr>
+              <w:t>+0.3</w:t>
+            </w:r>
+          </w:p>
+        </w:tc>
+        <w:tc>
+          <w:tcPr>
+            <w:tcW w:type="dxa" w:w="907"/>
+            <w:tcMar>
+              <w:top w:w="60" w:type="dxa"/>
+              <w:left w:w="100" w:type="dxa"/>
+              <w:bottom w:w="60" w:type="dxa"/>
+              <w:right w:w="100" w:type="dxa"/>
+            </w:tcMar>
+          </w:tcPr>
+          <w:p>
+            <w:pPr>
+              <w:spacing w:after="0" w:line="240" w:lineRule="auto"/>
+              <w:jc w:val="right"/>
+            </w:pPr>
+            <w:r>
+              <w:rPr>
+                <w:sz w:val="18"/>
+              </w:rPr>
+              <w:t>$0.039</w:t>
+            </w:r>
+          </w:p>
+        </w:tc>
+        <w:tc>
+          <w:tcPr>
+            <w:tcW w:type="dxa" w:w="1020"/>
+            <w:tcMar>
+              <w:top w:w="60" w:type="dxa"/>
+              <w:left w:w="100" w:type="dxa"/>
+              <w:bottom w:w="60" w:type="dxa"/>
+              <w:right w:w="100" w:type="dxa"/>
+            </w:tcMar>
+          </w:tcPr>
+          <w:p>
+            <w:pPr>
+              <w:spacing w:after="0" w:line="240" w:lineRule="auto"/>
+              <w:jc w:val="right"/>
+            </w:pPr>
+            <w:r>
+              <w:rPr>
+                <w:sz w:val="18"/>
+              </w:rPr>
+              <w:t>$0.038</w:t>
+            </w:r>
+          </w:p>
+        </w:tc>
+        <w:tc>
+          <w:tcPr>
+            <w:tcW w:type="dxa" w:w="907"/>
+            <w:tcMar>
+              <w:top w:w="60" w:type="dxa"/>
+              <w:left w:w="100" w:type="dxa"/>
+              <w:bottom w:w="60" w:type="dxa"/>
+              <w:right w:w="100" w:type="dxa"/>
+            </w:tcMar>
+          </w:tcPr>
+          <w:p>
+            <w:pPr>
+              <w:spacing w:after="0" w:line="240" w:lineRule="auto"/>
+            </w:pPr>
+            <w:r>
+              <w:rPr>
+                <w:sz w:val="18"/>
+              </w:rPr>
+              <w:t>+2%</w:t>
+            </w:r>
+          </w:p>
+        </w:tc>
+      </w:tr>
+      <w:tr>
+        <w:trPr>
+          <w:cantSplit/>
+        </w:trPr>
+        <w:tc>
+          <w:tcPr>
+            <w:tcW w:type="dxa" w:w="2608"/>
+            <w:tcMar>
+              <w:top w:w="60" w:type="dxa"/>
+              <w:left w:w="100" w:type="dxa"/>
+              <w:bottom w:w="60" w:type="dxa"/>
+              <w:right w:w="100" w:type="dxa"/>
+            </w:tcMar>
+          </w:tcPr>
+          <w:p>
+            <w:pPr>
+              <w:spacing w:after="0" w:line="240" w:lineRule="auto"/>
+            </w:pPr>
+            <w:r>
+              <w:rPr>
+                <w:sz w:val="18"/>
+              </w:rPr>
+              <w:t>D hybrid-ML + x4 spike</w:t>
+            </w:r>
+          </w:p>
+        </w:tc>
+        <w:tc>
+          <w:tcPr>
+            <w:tcW w:type="dxa" w:w="1247"/>
+            <w:tcMar>
+              <w:top w:w="60" w:type="dxa"/>
+              <w:left w:w="100" w:type="dxa"/>
+              <w:bottom w:w="60" w:type="dxa"/>
+              <w:right w:w="100" w:type="dxa"/>
+            </w:tcMar>
+          </w:tcPr>
+          <w:p>
+            <w:pPr>
+              <w:spacing w:after="0" w:line="240" w:lineRule="auto"/>
+              <w:jc w:val="right"/>
+            </w:pPr>
+            <w:r>
+              <w:rPr>
+                <w:sz w:val="18"/>
+              </w:rPr>
+              <w:t>20.0%</w:t>
+            </w:r>
+          </w:p>
+        </w:tc>
+        <w:tc>
+          <w:tcPr>
+            <w:tcW w:type="dxa" w:w="1361"/>
+            <w:tcMar>
+              <w:top w:w="60" w:type="dxa"/>
+              <w:left w:w="100" w:type="dxa"/>
+              <w:bottom w:w="60" w:type="dxa"/>
+              <w:right w:w="100" w:type="dxa"/>
+            </w:tcMar>
+          </w:tcPr>
+          <w:p>
+            <w:pPr>
+              <w:spacing w:after="0" w:line="240" w:lineRule="auto"/>
+              <w:jc w:val="right"/>
+            </w:pPr>
+            <w:r>
+              <w:rPr>
+                <w:sz w:val="18"/>
+              </w:rPr>
+              <w:t>34.2%</w:t>
+            </w:r>
+          </w:p>
+        </w:tc>
+        <w:tc>
+          <w:tcPr>
+            <w:tcW w:type="dxa" w:w="1020"/>
+            <w:tcMar>
+              <w:top w:w="60" w:type="dxa"/>
+              <w:left w:w="100" w:type="dxa"/>
+              <w:bottom w:w="60" w:type="dxa"/>
+              <w:right w:w="100" w:type="dxa"/>
+            </w:tcMar>
+          </w:tcPr>
+          <w:p>
+            <w:pPr>
+              <w:spacing w:after="0" w:line="240" w:lineRule="auto"/>
+              <w:jc w:val="right"/>
+            </w:pPr>
+            <w:r>
+              <w:rPr>
+                <w:sz w:val="18"/>
+              </w:rPr>
+              <w:t>-14.1</w:t>
+            </w:r>
+          </w:p>
+        </w:tc>
+        <w:tc>
+          <w:tcPr>
+            <w:tcW w:type="dxa" w:w="907"/>
+            <w:tcMar>
+              <w:top w:w="60" w:type="dxa"/>
+              <w:left w:w="100" w:type="dxa"/>
+              <w:bottom w:w="60" w:type="dxa"/>
+              <w:right w:w="100" w:type="dxa"/>
+            </w:tcMar>
+          </w:tcPr>
+          <w:p>
+            <w:pPr>
+              <w:spacing w:after="0" w:line="240" w:lineRule="auto"/>
+              <w:jc w:val="right"/>
+            </w:pPr>
+            <w:r>
+              <w:rPr>
+                <w:sz w:val="18"/>
+              </w:rPr>
+              <w:t>$0.124</w:t>
+            </w:r>
+          </w:p>
+        </w:tc>
+        <w:tc>
+          <w:tcPr>
+            <w:tcW w:type="dxa" w:w="1020"/>
+            <w:tcMar>
+              <w:top w:w="60" w:type="dxa"/>
+              <w:left w:w="100" w:type="dxa"/>
+              <w:bottom w:w="60" w:type="dxa"/>
+              <w:right w:w="100" w:type="dxa"/>
+            </w:tcMar>
+          </w:tcPr>
+          <w:p>
+            <w:pPr>
+              <w:spacing w:after="0" w:line="240" w:lineRule="auto"/>
+              <w:jc w:val="right"/>
+            </w:pPr>
+            <w:r>
+              <w:rPr>
+                <w:sz w:val="18"/>
+              </w:rPr>
+              <w:t>$0.203</w:t>
+            </w:r>
+          </w:p>
+        </w:tc>
+        <w:tc>
+          <w:tcPr>
+            <w:tcW w:type="dxa" w:w="907"/>
+            <w:tcMar>
+              <w:top w:w="60" w:type="dxa"/>
+              <w:left w:w="100" w:type="dxa"/>
+              <w:bottom w:w="60" w:type="dxa"/>
+              <w:right w:w="100" w:type="dxa"/>
+            </w:tcMar>
+          </w:tcPr>
+          <w:p>
+            <w:pPr>
+              <w:spacing w:after="0" w:line="240" w:lineRule="auto"/>
+              <w:jc w:val="right"/>
+            </w:pPr>
+            <w:r>
+              <w:rPr>
+                <w:sz w:val="18"/>
+              </w:rPr>
+              <w:t>-39%</w:t>
+            </w:r>
+          </w:p>
+        </w:tc>
+      </w:tr>
+    </w:tbl>
+    <w:p>
+      <w:pPr>
+        <w:spacing w:after="120"/>
+      </w:pPr>
+    </w:p>
+    <w:p>
+      <w:pPr>
+        <w:spacing w:after="140" w:before="0" w:line="340" w:lineRule="auto"/>
+        <w:jc w:val="both"/>
+      </w:pPr>
+      <w:r>
+        <w:rPr>
+          <w:b/>
+        </w:rPr>
+        <w:t>Reactive against hybrid (arms A and C).</w:t>
+      </w:r>
+      <w:r>
+        <w:rPr/>
+        <w:t xml:space="preserve"> On this window the two are practically equal. Arm A had 31 failed requests out of 23,511 (0.13%), a p95 of 566 ms and a total cost of $0.0380; arm C had no failed requests, a p95 of 585 ms and $0.0386. Both used about 0.84 instance-hours. The window is a smooth ramp (from about 3 to 18 requests per second on average over 38 minutes, minute-level coefficient of variation 0.21), so CPU-based target tracking kept up. The simulator's dropped load for reactive scaling comes from minute-level bursts across the whole population of heavy functions, which this one window does not contain. The honest reading is that arms A to C show the hybrid works and costs about the same as reactive scaling here; they do </w:t>
+      </w:r>
+      <w:r>
+        <w:rPr>
+          <w:b/>
+        </w:rPr>
+        <w:t>not</w:t>
+      </w:r>
+      <w:r>
+        <w:rPr/>
+        <w:t xml:space="preserve"> reproduce the simulated advantage.</w:t>
+      </w:r>
+    </w:p>
+    <w:p>
+      <w:pPr>
+        <w:spacing w:after="140" w:before="0" w:line="340" w:lineRule="auto"/>
+        <w:jc w:val="both"/>
+      </w:pPr>
+      <w:r>
+        <w:rPr>
+          <w:b/>
+        </w:rPr>
+        <w:t>Static against ML (arms B and C).</w:t>
+      </w:r>
+      <w:r>
+        <w:rPr/>
+        <w:t xml:space="preserve"> Arm B cost $0.0853, 2.2 times arm C ($0.0386). The static base is the q* quantile of the training period, 45.5 requests per second, which is 3 instances for the whole run, while the window ramps up from a few requests per second; arm B therefore pays for idle capacity (mean CPU 11% against 30% in arm C). The forecast follows the ramp. This is the clearest live benefit of forecasting, and it is against a static base, not against the rolling baseline.</w:t>
+      </w:r>
+    </w:p>
+    <w:p>
+      <w:pPr>
+        <w:spacing w:after="140" w:before="0" w:line="340" w:lineRule="auto"/>
+        <w:jc w:val="both"/>
+      </w:pPr>
+      <w:r>
+        <w:rPr>
+          <w:b/>
+        </w:rPr>
+        <w:t>Unseen spike (arm D).</w:t>
+      </w:r>
+      <w:r>
+        <w:rPr/>
+        <w:t xml:space="preserve"> In the spiked hour the planned load was 50.5 requests per second against a base of one instance (16 requests per second). No request failed in the whole run, and 48% of that hour's requests went to Lambda. But the hour's p95 latency was 3266 ms and the median latency of requests served by EC2 was 1946 ms, so 20% of all requests in arm D were slower than the 800 ms target or failed. Two causes are visible. First, the weights give EC2 its full measured capacity (about 16 requests per second), which leaves no headroom: with random arrivals a server fed at its limit builds a queue, so the p95-at-capacity measured in calibration does not hold on a sustained basis. Second, the load balancer's weight change takes about 12 s to apply and the observed rate is a 10-second average, so the first seconds of the spike went to EC2 unchanged. A safety factor on capacity (for example weights based on 70 to 80% of the measured capacity) would be the first fix; we did not test it. The Lambda-served requests in this arm were fast (p95 505 ms).</w:t>
+      </w:r>
+    </w:p>
+    <w:p>
+      <w:pPr>
+        <w:spacing w:after="140" w:before="0" w:line="340" w:lineRule="auto"/>
+        <w:jc w:val="both"/>
+      </w:pPr>
+      <w:r>
+        <w:rPr>
+          <w:b/>
+        </w:rPr>
+        <w:t>Delivered load.</w:t>
+      </w:r>
+      <w:r>
+        <w:rPr/>
+        <w:t xml:space="preserve"> The load generator is closed-loop: each simulated user waits for its response before sending the next request, so when latency rises the offered rate falls. In the spiked hour the generator delivered 31.8 requests per second against 50.5 planned, and arm D served 30,988 requests in total against 37,928 planned. The spike was therefore smaller in practice than intended. The same effect makes the slow EC2 tail self-limiting, which means the latency numbers are, if anything, optimistic.</w:t>
+      </w:r>
+    </w:p>
+    <w:p>
+      <w:pPr>
+        <w:spacing w:after="140" w:before="0" w:line="340" w:lineRule="auto"/>
+        <w:jc w:val="both"/>
+      </w:pPr>
+      <w:r>
+        <w:rPr>
+          <w:b/>
+        </w:rPr>
+        <w:t>Sim-to-real gap.</w:t>
+      </w:r>
+      <w:r>
+        <w:rPr/>
+        <w:t xml:space="preserve"> The replay assumes capacity is available instantly and that only the overflow reaches Lambda. For arms A, B and C the live Lambda share is +0.17 to +0.66 percentage points from the replay and the measured cost is +1.3% to +1.7% from it, which is small and, for arms B and C, in the direction of leakage (a little load reaches Lambda that the replay keeps on EC2). The replay of arm A uses the instance counts that the Auto Scaling Group actually had, so its cost agrees by construction. For arm D the gap is large: the live Lambda share is -14.1 points and the cost -39% from the replay, because the replay assumes the full planned spike is delivered and that exactly the overflow goes to Lambda, whereas live the generator delivered about 82% of the planned requests and EC2 absorbed more than its share. Weight changes take about 12 s to apply and new instances need 29 to 31 s to become healthy.</w:t>
+      </w:r>
+    </w:p>
+    <w:p>
+      <w:pPr>
+        <w:spacing w:after="140" w:before="0" w:line="340" w:lineRule="auto"/>
+        <w:jc w:val="both"/>
+      </w:pPr>
+      <w:r>
+        <w:rPr>
+          <w:b/>
+        </w:rPr>
+        <w:t>Start-up transient.</w:t>
+      </w:r>
+      <w:r>
+        <w:rPr/>
+        <w:t xml:space="preserve"> In each arm the first trace hour shows a slow tail (for example arm D hour 0: EC2 p95 of about 2.4 s), when the first instance has only just become healthy and is serving its first requests.</w:t>
       </w:r>
     </w:p>
     <w:p>
@@ -12138,7 +15258,7 @@
       </w:r>
       <w:r>
         <w:rPr/>
-        <w:t xml:space="preserve"> Load above the base goes to Lambda. Nothing is dropped, latency of the overflow is Lambda's (higher on a cold start), and cost rises by the Lambda price difference only for the excess. This is the failure the architecture is built to absorb.</w:t>
+        <w:t xml:space="preserve"> Load above the base goes to Lambda, so in the simulation nothing is dropped and cost rises only by the Lambda price difference for the excess. The live spike arm (Section 8.8) showed the caveat: no request failed, but latency suffered while EC2 was fed up to its full capacity and the weights caught up. The architecture absorbs the load; it does not by itself protect latency.</w:t>
       </w:r>
     </w:p>
     <w:p>
@@ -12211,7 +15331,7 @@
         <w:rPr>
           <w:sz w:val="22"/>
         </w:rPr>
-        <w:t>Table 13: Simulated spike results (monthly cost, test)</w:t>
+        <w:t>Table 16: Simulated spike results (monthly cost, test)</w:t>
       </w:r>
     </w:p>
     <w:tbl>
@@ -12970,7 +16090,7 @@
         <w:drawing>
           <wp:inline xmlns:a="http://schemas.openxmlformats.org/drawingml/2006/main" xmlns:pic="http://schemas.openxmlformats.org/drawingml/2006/picture">
             <wp:extent cx="5220000" cy="2247437"/>
-            <wp:docPr id="7" name="Picture 7"/>
+            <wp:docPr id="9" name="Picture 9"/>
             <wp:cNvGraphicFramePr>
               <a:graphicFrameLocks noChangeAspect="1"/>
             </wp:cNvGraphicFramePr>
@@ -12982,7 +16102,7 @@
                     <pic:cNvPicPr/>
                   </pic:nvPicPr>
                   <pic:blipFill>
-                    <a:blip r:embed="rId28"/>
+                    <a:blip r:embed="rId30"/>
                     <a:stretch>
                       <a:fillRect/>
                     </a:stretch>
@@ -13010,7 +16130,7 @@
         <w:rPr>
           <w:sz w:val="22"/>
         </w:rPr>
-        <w:t>Figure 7: Effect of an unseen spike on cost and unserved load</w:t>
+        <w:t>Figure 9: Effect of an unseen spike on cost and unserved load</w:t>
       </w:r>
     </w:p>
     <w:p>
@@ -13020,7 +16140,7 @@
       </w:pPr>
       <w:r>
         <w:rPr/>
-        <w:t>The hybrids serve all load in every case; the cost of a x5 spike is $4.4k (rolling) to $5.7k (ML) per month above the no-spike case. The ML forecaster reacts worse than the rolling quantile after a spike (x5: $37.8k against $36.6k), because its features also include the spiked hour and it over-raises the next base. A production system would clip forecasts that follow a detected anomaly. The reactive controller is unaffected in kind but still drops about 9.5% of load in every case. Live arm D repeats this test on AWS (Section 8.8).</w:t>
+        <w:t>The hybrids serve all load in every case; the cost of a x5 spike is $4.4k (rolling) to $5.7k (ML) per month above the no-spike case. The ML forecaster reacts worse than the rolling quantile after a spike (x5: $37.8k against $36.6k), because its features also include the spiked hour and it over-raises the next base. A production system would clip forecasts that follow a detected anomaly. The reactive controller is unaffected in kind but still drops about 9.5% of load in every case. Live arm D repeats this test on AWS (Section 8.8): there too nothing failed, but about 20% of requests exceeded the latency target, a cost the simulator does not model.</w:t>
       </w:r>
     </w:p>
     <w:p>
@@ -13036,7 +16156,7 @@
       </w:r>
       <w:r>
         <w:rPr/>
-        <w:t xml:space="preserve"> The newsvendor argument assumes the forecast quantile is calibrated. Coverage at the median is not (Table 3), so a forecaster used at low q* (cheap containers relative to Lambda) would be miscalibrated where it matters most. A sustained level shift larger than the lookback window would be absorbed by Lambda for several hours at higher cost before the base catches up, and a fully new function with no history has no forecast at all and must start on Lambda.</w:t>
+        <w:t xml:space="preserve"> The newsvendor argument assumes the forecast quantile is calibrated. Coverage at the median is not (Table 7), so a forecaster used at low q* (cheap containers relative to Lambda) would be miscalibrated where it matters most. A sustained level shift larger than the lookback window would be absorbed by Lambda for several hours at higher cost before the base catches up, and a fully new function with no history has no forecast at all and must start on Lambda.</w:t>
       </w:r>
     </w:p>
     <w:p>
@@ -13089,7 +16209,7 @@
       </w:r>
       <w:r>
         <w:rPr/>
-        <w:t xml:space="preserve"> Container capacity per unit is measured for one synthetic request type (400 ms service time, 20% CPU) on one instance type, from a coarse grid (16 req/s sustainable, 20 req/s failing). Real functions differ. Fargate capacity was never measured. Burstable t3 instances can run out of CPU credits under sustained load, which the short experiments do not exercise.</w:t>
+        <w:t xml:space="preserve"> Container capacity per unit is measured for one synthetic request type (400 ms service time, 20% CPU) on one instance type, from a coarse grid (16 req/s sustainable, 20 req/s failing). Real functions differ. Fargate capacity was never measured. Burstable t3 instances can run out of CPU credits under sustained load; credit balances were not measured in the short experiments.</w:t>
       </w:r>
     </w:p>
     <w:p>
@@ -13199,7 +16319,7 @@
       </w:r>
       <w:r>
         <w:rPr/>
-        <w:t xml:space="preserve"> Each arm is a time-compressed six-hour window run once, from one laptop and one function; no confidence intervals can be given. Cold-start behaviour of Lambda depends on how long environments stayed warm between arms.</w:t>
+        <w:t xml:space="preserve"> Each arm is a time-compressed six-hour window run once, from one laptop and one function; no confidence intervals can be given. Cold-start behaviour of Lambda depends on how long environments stayed warm between arms. The window is a smooth ramp, so it does not stress reactive scaling the way the simulated population does.</w:t>
       </w:r>
     </w:p>
     <w:p>
@@ -13217,11 +16337,11 @@
         <w:rPr>
           <w:b/>
         </w:rPr>
-        <w:t>Energy</w:t>
+        <w:t>Closed-loop load generator.</w:t>
       </w:r>
       <w:r>
         <w:rPr/>
-        <w:t xml:space="preserve"> is an estimate from a published methodology, not a measurement, and is sensitive to the idle-power coefficient.</w:t>
+        <w:t xml:space="preserve"> Locust users wait for each response, so when latency rises the offered load falls (arm D delivered about 63% of the planned rate in the spiked hour). Latency under overload is therefore understated.</w:t>
       </w:r>
     </w:p>
     <w:p>
@@ -13239,6 +16359,50 @@
         <w:rPr>
           <w:b/>
         </w:rPr>
+        <w:t>No capacity headroom.</w:t>
+      </w:r>
+      <w:r>
+        <w:rPr/>
+        <w:t xml:space="preserve"> The controller gives EC2 its full measured capacity; the spike arm shows this leaves no margin. A safety factor was not tested.</w:t>
+      </w:r>
+    </w:p>
+    <w:p>
+      <w:pPr>
+        <w:pStyle w:val="ListParagraph"/>
+        <w:spacing w:after="80" w:line="340" w:lineRule="auto"/>
+        <w:ind w:left="567" w:hanging="340"/>
+        <w:jc w:val="both"/>
+      </w:pPr>
+      <w:r>
+        <w:rPr/>
+        <w:t xml:space="preserve">•  </w:t>
+      </w:r>
+      <w:r>
+        <w:rPr>
+          <w:b/>
+        </w:rPr>
+        <w:t>Energy</w:t>
+      </w:r>
+      <w:r>
+        <w:rPr/>
+        <w:t xml:space="preserve"> is an estimate from a published methodology, not a measurement, and is sensitive to the idle-power coefficient.</w:t>
+      </w:r>
+    </w:p>
+    <w:p>
+      <w:pPr>
+        <w:pStyle w:val="ListParagraph"/>
+        <w:spacing w:after="80" w:line="340" w:lineRule="auto"/>
+        <w:ind w:left="567" w:hanging="340"/>
+        <w:jc w:val="both"/>
+      </w:pPr>
+      <w:r>
+        <w:rPr/>
+        <w:t xml:space="preserve">•  </w:t>
+      </w:r>
+      <w:r>
+        <w:rPr>
+          <w:b/>
+        </w:rPr>
         <w:t>Not covered.</w:t>
       </w:r>
       <w:r>
@@ -13273,6 +16437,16 @@
       <w:r>
         <w:rPr/>
         <w:t>Three results are weaker than the idea might suggest and are reported as found. The ML forecaster is only 0.25% cheaper than a rolling six-hour quantile on test, inside the noise of the assumptions, and the whole remaining headroom to the oracle is 5.4%. The advantage depends strongly on measured capacity per container and on the Lambda price (Section 8.7). By a documented estimate, the hybrid does not save energy relative to all-Lambda.</w:t>
+      </w:r>
+    </w:p>
+    <w:p>
+      <w:pPr>
+        <w:spacing w:after="140" w:before="0" w:line="340" w:lineRule="auto"/>
+        <w:jc w:val="both"/>
+      </w:pPr>
+      <w:r>
+        <w:rPr/>
+        <w:t>The live AWS runs confirm that the mechanism works: the controller sets instance counts from the forecast, shifts traffic to Lambda when load exceeds healthy capacity, and the replay of arms A to C agrees with the measurements to within about 2% in cost. They do not confirm a cost advantage over reactive scaling: on a smooth ramp arms A and C cost the same ($0.038 and $0.039), and the benefit shown was against a static base (arm B cost 2.2 times as much). The spike arm exposed a real weakness: with no failed requests, 20% of requests exceeded the latency target because EC2 was fed up to its measured capacity. Each live arm ran once, in compressed time, from one laptop, so the live evidence supports the design rather than a statistical ranking.</w:t>
       </w:r>
     </w:p>
     <w:p>
@@ -13753,7 +16927,7 @@
         <w:rPr>
           <w:sz w:val="22"/>
         </w:rPr>
-        <w:t>Table 14: Key parameters</w:t>
+        <w:t>Table 17: Key parameters</w:t>
       </w:r>
     </w:p>
     <w:tbl>

</xml_diff>

<commit_message>
Related work: hybrid VM/serverless papers; spend note; final report, slides, Q&A
</commit_message>
<xml_diff>
--- a/report/CostScale_Report.docx
+++ b/report/CostScale_Report.docx
@@ -368,7 +368,7 @@
         </w:rPr>
         <w:t>4. Data</w:t>
         <w:tab/>
-        <w:t>11</w:t>
+        <w:t>12</w:t>
       </w:r>
     </w:p>
     <w:p>
@@ -385,7 +385,7 @@
         </w:rPr>
         <w:t>4.1 Dataset</w:t>
         <w:tab/>
-        <w:t>11</w:t>
+        <w:t>12</w:t>
       </w:r>
     </w:p>
     <w:p>
@@ -402,7 +402,7 @@
         </w:rPr>
         <w:t>4.2 Filtering and joins</w:t>
         <w:tab/>
-        <w:t>11</w:t>
+        <w:t>12</w:t>
       </w:r>
     </w:p>
     <w:p>
@@ -419,7 +419,7 @@
         </w:rPr>
         <w:t>4.3 Load model and split</w:t>
         <w:tab/>
-        <w:t>12</w:t>
+        <w:t>13</w:t>
       </w:r>
     </w:p>
     <w:p>
@@ -436,7 +436,7 @@
         </w:rPr>
         <w:t>4.4 Heavy functions</w:t>
         <w:tab/>
-        <w:t>12</w:t>
+        <w:t>13</w:t>
       </w:r>
     </w:p>
     <w:p>
@@ -453,7 +453,7 @@
         </w:rPr>
         <w:t>5. Methodology</w:t>
         <w:tab/>
-        <w:t>13</w:t>
+        <w:t>14</w:t>
       </w:r>
     </w:p>
     <w:p>
@@ -470,7 +470,7 @@
         </w:rPr>
         <w:t>5.1 Cost model</w:t>
         <w:tab/>
-        <w:t>13</w:t>
+        <w:t>14</w:t>
       </w:r>
     </w:p>
     <w:p>
@@ -487,7 +487,7 @@
         </w:rPr>
         <w:t>5.2 Newsvendor rule for the base</w:t>
         <w:tab/>
-        <w:t>13</w:t>
+        <w:t>14</w:t>
       </w:r>
     </w:p>
     <w:p>
@@ -504,7 +504,7 @@
         </w:rPr>
         <w:t>5.3 Forecaster</w:t>
         <w:tab/>
-        <w:t>13</w:t>
+        <w:t>14</w:t>
       </w:r>
     </w:p>
     <w:p>
@@ -521,7 +521,7 @@
         </w:rPr>
         <w:t>5.4 Strategies compared</w:t>
         <w:tab/>
-        <w:t>14</w:t>
+        <w:t>15</w:t>
       </w:r>
     </w:p>
     <w:p>
@@ -538,7 +538,7 @@
         </w:rPr>
         <w:t>6. System design</w:t>
         <w:tab/>
-        <w:t>15</w:t>
+        <w:t>16</w:t>
       </w:r>
     </w:p>
     <w:p>
@@ -555,7 +555,7 @@
         </w:rPr>
         <w:t>6.1 Architecture</w:t>
         <w:tab/>
-        <w:t>15</w:t>
+        <w:t>16</w:t>
       </w:r>
     </w:p>
     <w:p>
@@ -572,7 +572,7 @@
         </w:rPr>
         <w:t>6.2 Two time scales</w:t>
         <w:tab/>
-        <w:t>15</w:t>
+        <w:t>16</w:t>
       </w:r>
     </w:p>
     <w:p>
@@ -589,7 +589,7 @@
         </w:rPr>
         <w:t>6.3 Controller algorithm</w:t>
         <w:tab/>
-        <w:t>15</w:t>
+        <w:t>16</w:t>
       </w:r>
     </w:p>
     <w:p>
@@ -606,7 +606,7 @@
         </w:rPr>
         <w:t>7. Implementation</w:t>
         <w:tab/>
-        <w:t>17</w:t>
+        <w:t>18</w:t>
       </w:r>
     </w:p>
     <w:p>
@@ -623,7 +623,7 @@
         </w:rPr>
         <w:t>7.1 Repository and tooling</w:t>
         <w:tab/>
-        <w:t>17</w:t>
+        <w:t>18</w:t>
       </w:r>
     </w:p>
     <w:p>
@@ -640,7 +640,7 @@
         </w:rPr>
         <w:t>7.2 Application</w:t>
         <w:tab/>
-        <w:t>17</w:t>
+        <w:t>18</w:t>
       </w:r>
     </w:p>
     <w:p>
@@ -657,7 +657,7 @@
         </w:rPr>
         <w:t>7.3 Workload for the live demo</w:t>
         <w:tab/>
-        <w:t>17</w:t>
+        <w:t>18</w:t>
       </w:r>
     </w:p>
     <w:p>
@@ -674,7 +674,7 @@
         </w:rPr>
         <w:t>7.4 Calibration</w:t>
         <w:tab/>
-        <w:t>18</w:t>
+        <w:t>19</w:t>
       </w:r>
     </w:p>
     <w:p>
@@ -691,7 +691,7 @@
         </w:rPr>
         <w:t>7.5 What was not run live</w:t>
         <w:tab/>
-        <w:t>18</w:t>
+        <w:t>19</w:t>
       </w:r>
     </w:p>
     <w:p>
@@ -708,7 +708,7 @@
         </w:rPr>
         <w:t>8. Evaluation</w:t>
         <w:tab/>
-        <w:t>19</w:t>
+        <w:t>20</w:t>
       </w:r>
     </w:p>
     <w:p>
@@ -725,7 +725,7 @@
         </w:rPr>
         <w:t>8.1 Set-up</w:t>
         <w:tab/>
-        <w:t>19</w:t>
+        <w:t>20</w:t>
       </w:r>
     </w:p>
     <w:p>
@@ -742,7 +742,7 @@
         </w:rPr>
         <w:t>8.2 Prediction accuracy</w:t>
         <w:tab/>
-        <w:t>19</w:t>
+        <w:t>20</w:t>
       </w:r>
     </w:p>
     <w:p>
@@ -759,7 +759,7 @@
         </w:rPr>
         <w:t>8.3 Decision cost, utilisation and unserved load</w:t>
         <w:tab/>
-        <w:t>21</w:t>
+        <w:t>22</w:t>
       </w:r>
     </w:p>
     <w:p>
@@ -776,7 +776,7 @@
         </w:rPr>
         <w:t>8.4 Does the ML forecaster help?</w:t>
         <w:tab/>
-        <w:t>23</w:t>
+        <w:t>24</w:t>
       </w:r>
     </w:p>
     <w:p>
@@ -793,7 +793,7 @@
         </w:rPr>
         <w:t>8.5 Latency</w:t>
         <w:tab/>
-        <w:t>23</w:t>
+        <w:t>24</w:t>
       </w:r>
     </w:p>
     <w:p>
@@ -810,7 +810,7 @@
         </w:rPr>
         <w:t>8.6 Energy (estimate)</w:t>
         <w:tab/>
-        <w:t>24</w:t>
+        <w:t>25</w:t>
       </w:r>
     </w:p>
     <w:p>
@@ -827,7 +827,7 @@
         </w:rPr>
         <w:t>8.7 Per-function distribution and sensitivity</w:t>
         <w:tab/>
-        <w:t>24</w:t>
+        <w:t>25</w:t>
       </w:r>
     </w:p>
     <w:p>
@@ -844,7 +844,7 @@
         </w:rPr>
         <w:t>8.8 Live results and sim-to-real gap</w:t>
         <w:tab/>
-        <w:t>25</w:t>
+        <w:t>26</w:t>
       </w:r>
     </w:p>
     <w:p>
@@ -861,7 +861,7 @@
         </w:rPr>
         <w:t>8.9 Validation of the newsvendor rule</w:t>
         <w:tab/>
-        <w:t>29</w:t>
+        <w:t>30</w:t>
       </w:r>
     </w:p>
     <w:p>
@@ -878,7 +878,7 @@
         </w:rPr>
         <w:t>9. What happens when the prediction is wrong</w:t>
         <w:tab/>
-        <w:t>30</w:t>
+        <w:t>31</w:t>
       </w:r>
     </w:p>
     <w:p>
@@ -895,7 +895,7 @@
         </w:rPr>
         <w:t>10. Limitations</w:t>
         <w:tab/>
-        <w:t>32</w:t>
+        <w:t>33</w:t>
       </w:r>
     </w:p>
     <w:p>
@@ -912,7 +912,7 @@
         </w:rPr>
         <w:t>11. Conclusion</w:t>
         <w:tab/>
-        <w:t>34</w:t>
+        <w:t>35</w:t>
       </w:r>
     </w:p>
     <w:p>
@@ -929,7 +929,7 @@
         </w:rPr>
         <w:t>12. Future work</w:t>
         <w:tab/>
-        <w:t>35</w:t>
+        <w:t>36</w:t>
       </w:r>
     </w:p>
     <w:p>
@@ -946,7 +946,7 @@
         </w:rPr>
         <w:t>References</w:t>
         <w:tab/>
-        <w:t>36</w:t>
+        <w:t>37</w:t>
       </w:r>
     </w:p>
     <w:p>
@@ -963,7 +963,7 @@
         </w:rPr>
         <w:t>Appendix A: Reproduction steps</w:t>
         <w:tab/>
-        <w:t>37</w:t>
+        <w:t>39</w:t>
       </w:r>
     </w:p>
     <w:p>
@@ -980,7 +980,7 @@
         </w:rPr>
         <w:t>A.1 Parameters</w:t>
         <w:tab/>
-        <w:t>37</w:t>
+        <w:t>39</w:t>
       </w:r>
     </w:p>
     <w:p>
@@ -2039,7 +2039,33 @@
       </w:r>
       <w:r>
         <w:rPr/>
-        <w:t xml:space="preserve"> MArk [2] is a machine-learning inference serving system built on AWS. According to the paper's abstract it uses predictive autoscaling to hide provisioning latency at low cost, and uses more flexible but pricier serverless instances to absorb occasional spikes that are hard to predict. That is the closest design to CostScale. CostScale differs in being workload-agnostic, in deriving the base size from a price-ratio quantile rather than a heuristic, and in comparing against reactive scaling on a public production trace.</w:t>
+        <w:t xml:space="preserve"> MArk [2] is a machine-learning inference serving system built on AWS. According to the paper's abstract it uses predictive autoscaling to hide provisioning latency at low cost, and uses more flexible but pricier serverless instances to absorb occasional spikes that are hard to predict.</w:t>
+      </w:r>
+    </w:p>
+    <w:p>
+      <w:pPr>
+        <w:spacing w:after="140" w:before="0" w:line="340" w:lineRule="auto"/>
+        <w:jc w:val="both"/>
+      </w:pPr>
+      <w:r>
+        <w:rPr>
+          <w:b/>
+        </w:rPr>
+        <w:t>Hybrid VM and serverless designs.</w:t>
+      </w:r>
+      <w:r>
+        <w:rPr/>
+        <w:t xml:space="preserve"> Several works combine provisioned VMs with serverless functions, and some are closer to CostScale than MArk. LIBRA [10] (IEEE IC2E 2021) provisions both VM and serverless capacity to minimise cost under SLAs; its abstract reports more than 85% fewer SLA violations and up to 53% lower cost on real traces, in simulation and on AWS, and does not give the routing algorithm. Spandana [11] (arXiv preprint, 2026) places a lightweight controller next to each application VM that decides </w:t>
+      </w:r>
+      <w:r>
+        <w:rPr>
+          <w:b/>
+        </w:rPr>
+        <w:t>per request</w:t>
+      </w:r>
+      <w:r>
+        <w:rPr/>
+        <w:t xml:space="preserve"> whether to serve it locally or forward it to a FaaS layer such as AWS Lambda, keeping requests that can meet the SLO on the VM; its abstract reports 76-86% CPU utilisation and 5-44% lower cost than three baselines. Flare [12] (arXiv preprint, 2026) runs steady traffic on VMs and shifts the excess load of overloaded microservices to serverless. We read only the abstracts of [10]-[12], not the full papers. CostScale therefore does not claim that a VM base with serverless overflow is new. What it adds, as far as the abstracts show, is an explicit price-ratio rule for the size of the base (the newsvendor quantile of Section 5.2) and a measured comparison with reactive scaling on a public production trace plus a live AWS check. Unlike Spandana, it routes by weighted target groups rather than per request, which is the weaker mechanism (Section 8.8).</w:t>
       </w:r>
     </w:p>
     <w:p>
@@ -3898,7 +3924,7 @@
       </w:r>
       <w:r>
         <w:rPr/>
-        <w:t>; the default VPC is used; there is no NAT gateway and no RDS. AWS Budgets alerts are set at $30, $60 and $80.</w:t>
+        <w:t>; the default VPC is used; there is no NAT gateway and no RDS. AWS Budgets alerts are set at $30, $60 and $80. By our own estimate the whole live phase cost roughly half a dollar (about 5 instance-hours, about 3.4 hours of load balancer and under $0.1 of Lambda); AWS's billing figure lags by about a day and was not available when this report was written.</w:t>
       </w:r>
     </w:p>
     <w:p>
@@ -14182,7 +14208,7 @@
       <w:r>
         <w:drawing>
           <wp:inline xmlns:a="http://schemas.openxmlformats.org/drawingml/2006/main" xmlns:pic="http://schemas.openxmlformats.org/drawingml/2006/picture">
-            <wp:extent cx="5400000" cy="2032385"/>
+            <wp:extent cx="5400000" cy="1977243"/>
             <wp:docPr id="8" name="Picture 8"/>
             <wp:cNvGraphicFramePr>
               <a:graphicFrameLocks noChangeAspect="1"/>
@@ -14203,7 +14229,7 @@
                   <pic:spPr>
                     <a:xfrm>
                       <a:off x="0" y="0"/>
-                      <a:ext cx="5400000" cy="2032385"/>
+                      <a:ext cx="5400000" cy="1977243"/>
                     </a:xfrm>
                     <a:prstGeom prst="rect"/>
                   </pic:spPr>
@@ -16587,7 +16613,7 @@
       </w:r>
       <w:r>
         <w:rPr/>
-        <w:t xml:space="preserve"> Replace weighted routing with an overflow-aware mechanism to remove the ALB leakage measured in Section 8.8.</w:t>
+        <w:t xml:space="preserve"> Replace weighted routing with per-request spillover, where each instance forwards a request to Lambda only when it is full, as Spandana [11] describes, to remove the ALB leakage measured in Section 8.8. We did not implement or test this.</w:t>
       </w:r>
     </w:p>
     <w:p>
@@ -16718,6 +16744,39 @@
       <w:r>
         <w:rPr/>
         <w:t>[9] Cloud Carbon Footprint, "Methodology." https://www.cloudcarbonfootprint.org/docs/methodology/ (accessed 24 October 2026).</w:t>
+      </w:r>
+    </w:p>
+    <w:p>
+      <w:pPr>
+        <w:spacing w:after="120" w:before="0" w:line="276" w:lineRule="auto"/>
+        <w:ind w:left="540" w:hanging="540"/>
+        <w:jc w:val="left"/>
+      </w:pPr>
+      <w:r>
+        <w:rPr/>
+        <w:t>[10] A. Raza, Z. Zhang, N. Akhtar, V. Isahagian and I. Matta, "LIBRA: An Economical Hybrid Approach for Cloud Applications with Strict SLAs," 9th IEEE International Conference on Cloud Engineering (IC2E), 2021; arXiv:2104.05491. https://arxiv.org/abs/2104.05491 (abstract read; accessed 24 October 2026).</w:t>
+      </w:r>
+    </w:p>
+    <w:p>
+      <w:pPr>
+        <w:spacing w:after="120" w:before="0" w:line="276" w:lineRule="auto"/>
+        <w:ind w:left="540" w:hanging="540"/>
+        <w:jc w:val="left"/>
+      </w:pPr>
+      <w:r>
+        <w:rPr/>
+        <w:t>[11] D. Dehigama, S. Jesalpura, Z. Xu, M. Nemeth, S. Zhu, M. Kogias and B. Grot, "Spandana: Reconciling Strict SLOs with Low Cost under Fine-Grained Load Fluctuations," arXiv:2606.30533, June 2026 (preprint). https://arxiv.org/abs/2606.30533 (abstract read; accessed 24 October 2026).</w:t>
+      </w:r>
+    </w:p>
+    <w:p>
+      <w:pPr>
+        <w:spacing w:after="120" w:before="0" w:line="276" w:lineRule="auto"/>
+        <w:ind w:left="540" w:hanging="540"/>
+        <w:jc w:val="left"/>
+      </w:pPr>
+      <w:r>
+        <w:rPr/>
+        <w:t>[12] D. Dehigama, S. Jesalpura, D. Schall, A. Katsarakis, M. Kogias, R. Kumar and B. Grot, "Flare: Leveraging Serverless Elasticity to Absorb Microservice Load Spikes," arXiv:2605.23707, May 2026 (preprint). https://arxiv.org/abs/2605.23707 (abstract read; accessed 24 October 2026).</w:t>
       </w:r>
     </w:p>
     <w:p>

</xml_diff>